<commit_message>
clone and push again.
</commit_message>
<xml_diff>
--- a/Object Oriented Programming/Assignment/[CMP5332 OOP] Library System - Feature and Responsibility Checklist.docx
+++ b/Object Oriented Programming/Assignment/[CMP5332 OOP] Library System - Feature and Responsibility Checklist.docx
@@ -152,7 +152,13 @@
                 <wp:inline distT="0" distB="0" distL="0" distR="0" wp14:anchorId="64CB417C" wp14:editId="649C1074">
                   <wp:extent cx="1542958" cy="430563"/>
                   <wp:effectExtent l="0" t="0" r="92" b="7587"/>
-                  <wp:docPr id="1" name="Picture 1" descr="New Logo Tiny"/>
+                  <wp:docPr id="1" name="Picture 1" descr="New Logo Tiny">
+                    <a:extLst xmlns:a="http://schemas.openxmlformats.org/drawingml/2006/main">
+                      <a:ext uri="{FF2B5EF4-FFF2-40B4-BE49-F238E27FC236}">
+                        <a16:creationId xmlns:a16="http://schemas.microsoft.com/office/drawing/2014/main" id="{0991AB66-474F-4A4D-A721-DAE685F0C86D}"/>
+                      </a:ext>
+                    </a:extLst>
+                  </wp:docPr>
                   <wp:cNvGraphicFramePr/>
                   <a:graphic xmlns:a="http://schemas.openxmlformats.org/drawingml/2006/main">
                     <a:graphicData uri="http://schemas.openxmlformats.org/drawingml/2006/picture">
@@ -398,6 +404,17 @@
                 <w:szCs w:val="20"/>
               </w:rPr>
             </w:pPr>
+            <w:r>
+              <w:rPr>
+                <w:rFonts w:ascii="Arial" w:hAnsi="Arial"/>
+                <w:i/>
+                <w:iCs/>
+                <w:color w:val="000000" w:themeColor="text1"/>
+                <w:sz w:val="20"/>
+                <w:szCs w:val="20"/>
+              </w:rPr>
+              <w:t>Orlando Igwe</w:t>
+            </w:r>
           </w:p>
         </w:tc>
         <w:tc>
@@ -427,9 +444,18 @@
                 <w:iCs/>
                 <w:color w:val="000000" w:themeColor="text1"/>
                 <w:sz w:val="20"/>
-                <w:szCs w:val="20"/>
-              </w:rPr>
-            </w:pPr>
+              </w:rPr>
+            </w:pPr>
+            <w:r>
+              <w:rPr>
+                <w:rFonts w:ascii="Arial" w:hAnsi="Arial"/>
+                <w:i/>
+                <w:iCs/>
+                <w:color w:val="000000" w:themeColor="text1"/>
+                <w:sz w:val="20"/>
+              </w:rPr>
+              <w:t>Shingirai Rukuni</w:t>
+            </w:r>
           </w:p>
         </w:tc>
       </w:tr>
@@ -552,6 +578,17 @@
                 <w:szCs w:val="20"/>
               </w:rPr>
             </w:pPr>
+            <w:r>
+              <w:rPr>
+                <w:rFonts w:ascii="Arial" w:hAnsi="Arial"/>
+                <w:i/>
+                <w:iCs/>
+                <w:color w:val="000000" w:themeColor="text1"/>
+                <w:sz w:val="20"/>
+                <w:szCs w:val="20"/>
+              </w:rPr>
+              <w:t>23169111</w:t>
+            </w:r>
           </w:p>
         </w:tc>
         <w:tc>
@@ -960,7 +997,6 @@
               </w:rPr>
               <w:t xml:space="preserve">Dr. </w:t>
             </w:r>
-            <w:proofErr w:type="spellStart"/>
             <w:r>
               <w:rPr>
                 <w:rFonts w:ascii="Arial" w:hAnsi="Arial"/>
@@ -968,17 +1004,7 @@
                 <w:sz w:val="20"/>
                 <w:szCs w:val="20"/>
               </w:rPr>
-              <w:t>Quanbin</w:t>
-            </w:r>
-            <w:proofErr w:type="spellEnd"/>
-            <w:r>
-              <w:rPr>
-                <w:rFonts w:ascii="Arial" w:hAnsi="Arial"/>
-                <w:color w:val="000000" w:themeColor="text1"/>
-                <w:sz w:val="20"/>
-                <w:szCs w:val="20"/>
-              </w:rPr>
-              <w:t xml:space="preserve"> Sun</w:t>
+              <w:t>Quanbin Sun</w:t>
             </w:r>
           </w:p>
         </w:tc>
@@ -1105,7 +1131,7 @@
               <w:pStyle w:val="ListParagraph"/>
               <w:numPr>
                 <w:ilvl w:val="0"/>
-                <w:numId w:val="2"/>
+                <w:numId w:val="4"/>
               </w:numPr>
               <w:spacing w:beforeAutospacing="1" w:afterAutospacing="1"/>
             </w:pPr>
@@ -1148,7 +1174,7 @@
               <w:pStyle w:val="ListParagraph"/>
               <w:numPr>
                 <w:ilvl w:val="0"/>
-                <w:numId w:val="2"/>
+                <w:numId w:val="4"/>
               </w:numPr>
               <w:spacing w:beforeAutospacing="1" w:afterAutospacing="1"/>
             </w:pPr>
@@ -1168,7 +1194,7 @@
               <w:pStyle w:val="ListParagraph"/>
               <w:numPr>
                 <w:ilvl w:val="0"/>
-                <w:numId w:val="2"/>
+                <w:numId w:val="4"/>
               </w:numPr>
               <w:spacing w:before="240" w:after="240"/>
             </w:pPr>
@@ -1209,7 +1235,7 @@
               <w:pStyle w:val="ListParagraph"/>
               <w:numPr>
                 <w:ilvl w:val="0"/>
-                <w:numId w:val="2"/>
+                <w:numId w:val="4"/>
               </w:numPr>
               <w:spacing w:before="240" w:after="240"/>
             </w:pPr>
@@ -1240,7 +1266,7 @@
               <w:pStyle w:val="ListParagraph"/>
               <w:numPr>
                 <w:ilvl w:val="0"/>
-                <w:numId w:val="2"/>
+                <w:numId w:val="4"/>
               </w:numPr>
               <w:spacing w:before="240" w:after="240"/>
             </w:pPr>
@@ -1269,7 +1295,7 @@
               <w:pStyle w:val="ListParagraph"/>
               <w:numPr>
                 <w:ilvl w:val="0"/>
-                <w:numId w:val="2"/>
+                <w:numId w:val="4"/>
               </w:numPr>
               <w:spacing w:before="240" w:after="240"/>
             </w:pPr>
@@ -1298,7 +1324,7 @@
               <w:pStyle w:val="ListParagraph"/>
               <w:numPr>
                 <w:ilvl w:val="0"/>
-                <w:numId w:val="2"/>
+                <w:numId w:val="4"/>
               </w:numPr>
               <w:spacing w:before="240" w:after="240"/>
             </w:pPr>
@@ -1446,7 +1472,7 @@
               <w:pStyle w:val="ListParagraph"/>
               <w:numPr>
                 <w:ilvl w:val="0"/>
-                <w:numId w:val="22"/>
+                <w:numId w:val="6"/>
               </w:numPr>
               <w:autoSpaceDE w:val="0"/>
               <w:autoSpaceDN w:val="0"/>
@@ -1508,7 +1534,7 @@
                 <w:sz w:val="22"/>
                 <w:szCs w:val="22"/>
               </w:rPr>
-              <w:t>None</w:t>
+              <w:t>Alex</w:t>
             </w:r>
           </w:p>
         </w:tc>
@@ -1526,7 +1552,7 @@
               <w:pStyle w:val="ListParagraph"/>
               <w:numPr>
                 <w:ilvl w:val="0"/>
-                <w:numId w:val="22"/>
+                <w:numId w:val="6"/>
               </w:numPr>
               <w:jc w:val="both"/>
               <w:rPr>
@@ -1599,36 +1625,14 @@
               </w:rPr>
               <w:t xml:space="preserve">implement </w:t>
             </w:r>
-            <w:proofErr w:type="spellStart"/>
-            <w:proofErr w:type="gramStart"/>
-            <w:r>
-              <w:rPr>
-                <w:color w:val="000000" w:themeColor="text1"/>
-                <w:sz w:val="23"/>
-                <w:szCs w:val="23"/>
-                <w:lang w:eastAsia="en-GB"/>
-              </w:rPr>
-              <w:t>getDetailsLong</w:t>
-            </w:r>
-            <w:proofErr w:type="spellEnd"/>
-            <w:r>
-              <w:rPr>
-                <w:color w:val="000000" w:themeColor="text1"/>
-                <w:sz w:val="23"/>
-                <w:szCs w:val="23"/>
-                <w:lang w:eastAsia="en-GB"/>
-              </w:rPr>
-              <w:t>(</w:t>
-            </w:r>
-            <w:proofErr w:type="gramEnd"/>
-            <w:r>
-              <w:rPr>
-                <w:color w:val="000000" w:themeColor="text1"/>
-                <w:sz w:val="23"/>
-                <w:szCs w:val="23"/>
-                <w:lang w:eastAsia="en-GB"/>
-              </w:rPr>
-              <w:t>)</w:t>
+            <w:r>
+              <w:rPr>
+                <w:color w:val="000000" w:themeColor="text1"/>
+                <w:sz w:val="23"/>
+                <w:szCs w:val="23"/>
+                <w:lang w:eastAsia="en-GB"/>
+              </w:rPr>
+              <w:t>getDetailsLong()</w:t>
             </w:r>
             <w:r>
               <w:rPr>
@@ -1661,8 +1665,6 @@
           <w:p>
             <w:pPr>
               <w:jc w:val="center"/>
-            </w:pPr>
-            <w:r>
               <w:rPr>
                 <w:rFonts w:ascii="MS Gothic" w:eastAsia="MS Gothic" w:hAnsi="MS Gothic" w:cstheme="minorBidi"/>
                 <w:b/>
@@ -1670,12 +1672,8 @@
                 <w:sz w:val="22"/>
                 <w:szCs w:val="22"/>
               </w:rPr>
-              <w:t>None</w:t>
-            </w:r>
-          </w:p>
-          <w:p>
-            <w:pPr>
-              <w:jc w:val="center"/>
+            </w:pPr>
+            <w:r>
               <w:rPr>
                 <w:rFonts w:ascii="MS Gothic" w:eastAsia="MS Gothic" w:hAnsi="MS Gothic" w:cstheme="minorBidi"/>
                 <w:b/>
@@ -1683,7 +1681,18 @@
                 <w:sz w:val="22"/>
                 <w:szCs w:val="22"/>
               </w:rPr>
-            </w:pPr>
+              <w:t>Alex</w:t>
+            </w:r>
+            <w:r>
+              <w:rPr>
+                <w:rFonts w:ascii="MS Gothic" w:eastAsia="MS Gothic" w:hAnsi="MS Gothic" w:cstheme="minorBidi"/>
+                <w:b/>
+                <w:bCs/>
+                <w:sz w:val="22"/>
+                <w:szCs w:val="22"/>
+              </w:rPr>
+              <w:t xml:space="preserve"> </w:t>
+            </w:r>
           </w:p>
         </w:tc>
       </w:tr>
@@ -1700,7 +1709,7 @@
               <w:pStyle w:val="ListParagraph"/>
               <w:numPr>
                 <w:ilvl w:val="0"/>
-                <w:numId w:val="22"/>
+                <w:numId w:val="6"/>
               </w:numPr>
               <w:jc w:val="both"/>
               <w:rPr>
@@ -1822,8 +1831,6 @@
           <w:p>
             <w:pPr>
               <w:jc w:val="center"/>
-            </w:pPr>
-            <w:r>
               <w:rPr>
                 <w:rFonts w:ascii="MS Gothic" w:eastAsia="MS Gothic" w:hAnsi="MS Gothic" w:cstheme="minorBidi"/>
                 <w:b/>
@@ -1831,12 +1838,8 @@
                 <w:sz w:val="22"/>
                 <w:szCs w:val="22"/>
               </w:rPr>
-              <w:t>None</w:t>
-            </w:r>
-          </w:p>
-          <w:p>
-            <w:pPr>
-              <w:jc w:val="center"/>
+            </w:pPr>
+            <w:r>
               <w:rPr>
                 <w:rFonts w:ascii="MS Gothic" w:eastAsia="MS Gothic" w:hAnsi="MS Gothic" w:cstheme="minorBidi"/>
                 <w:b/>
@@ -1844,7 +1847,18 @@
                 <w:sz w:val="22"/>
                 <w:szCs w:val="22"/>
               </w:rPr>
-            </w:pPr>
+              <w:t>Alex</w:t>
+            </w:r>
+            <w:r>
+              <w:rPr>
+                <w:rFonts w:ascii="MS Gothic" w:eastAsia="MS Gothic" w:hAnsi="MS Gothic" w:cstheme="minorBidi"/>
+                <w:b/>
+                <w:bCs/>
+                <w:sz w:val="22"/>
+                <w:szCs w:val="22"/>
+              </w:rPr>
+              <w:t xml:space="preserve"> </w:t>
+            </w:r>
           </w:p>
         </w:tc>
       </w:tr>
@@ -1861,7 +1875,7 @@
               <w:pStyle w:val="ListParagraph"/>
               <w:numPr>
                 <w:ilvl w:val="0"/>
-                <w:numId w:val="22"/>
+                <w:numId w:val="6"/>
               </w:numPr>
               <w:autoSpaceDE w:val="0"/>
               <w:autoSpaceDN w:val="0"/>
@@ -1923,8 +1937,6 @@
           <w:p>
             <w:pPr>
               <w:jc w:val="center"/>
-            </w:pPr>
-            <w:r>
               <w:rPr>
                 <w:rFonts w:ascii="MS Gothic" w:eastAsia="MS Gothic" w:hAnsi="MS Gothic" w:cstheme="minorBidi"/>
                 <w:b/>
@@ -1932,12 +1944,8 @@
                 <w:sz w:val="22"/>
                 <w:szCs w:val="22"/>
               </w:rPr>
-              <w:t>None</w:t>
-            </w:r>
-          </w:p>
-          <w:p>
-            <w:pPr>
-              <w:jc w:val="center"/>
+            </w:pPr>
+            <w:r>
               <w:rPr>
                 <w:rFonts w:ascii="MS Gothic" w:eastAsia="MS Gothic" w:hAnsi="MS Gothic" w:cstheme="minorBidi"/>
                 <w:b/>
@@ -1945,7 +1953,18 @@
                 <w:sz w:val="22"/>
                 <w:szCs w:val="22"/>
               </w:rPr>
-            </w:pPr>
+              <w:t>Alex</w:t>
+            </w:r>
+            <w:r>
+              <w:rPr>
+                <w:rFonts w:ascii="MS Gothic" w:eastAsia="MS Gothic" w:hAnsi="MS Gothic" w:cstheme="minorBidi"/>
+                <w:b/>
+                <w:bCs/>
+                <w:sz w:val="22"/>
+                <w:szCs w:val="22"/>
+              </w:rPr>
+              <w:t xml:space="preserve"> </w:t>
+            </w:r>
           </w:p>
         </w:tc>
       </w:tr>
@@ -1962,7 +1981,7 @@
               <w:pStyle w:val="ListParagraph"/>
               <w:numPr>
                 <w:ilvl w:val="0"/>
-                <w:numId w:val="22"/>
+                <w:numId w:val="6"/>
               </w:numPr>
               <w:autoSpaceDE w:val="0"/>
               <w:autoSpaceDN w:val="0"/>
@@ -2027,27 +2046,7 @@
                 <w:szCs w:val="23"/>
                 <w:lang w:eastAsia="en-GB"/>
               </w:rPr>
-              <w:t xml:space="preserve"> When a book is issued to a Patron a Loan object must be created holding a reference to the Book being issued, to the Patron borrowing the Book and the Due Date of the Loan. This object should be added to the </w:t>
-            </w:r>
-            <w:proofErr w:type="gramStart"/>
-            <w:r>
-              <w:rPr>
-                <w:color w:val="000000" w:themeColor="text1"/>
-                <w:sz w:val="23"/>
-                <w:szCs w:val="23"/>
-                <w:lang w:eastAsia="en-GB"/>
-              </w:rPr>
-              <w:t>Book</w:t>
-            </w:r>
-            <w:proofErr w:type="gramEnd"/>
-            <w:r>
-              <w:rPr>
-                <w:color w:val="000000" w:themeColor="text1"/>
-                <w:sz w:val="23"/>
-                <w:szCs w:val="23"/>
-                <w:lang w:eastAsia="en-GB"/>
-              </w:rPr>
-              <w:t xml:space="preserve"> and the book should be added to the Patron’s list of borrowed Books.</w:t>
+              <w:t xml:space="preserve"> When a book is issued to a Patron a Loan object must be created holding a reference to the Book being issued, to the Patron borrowing the Book and the Due Date of the Loan. This object should be added to the Book and the book should be added to the Patron’s list of borrowed Books.</w:t>
             </w:r>
           </w:p>
           <w:p>
@@ -2071,8 +2070,6 @@
           <w:p>
             <w:pPr>
               <w:jc w:val="center"/>
-            </w:pPr>
-            <w:r>
               <w:rPr>
                 <w:rFonts w:ascii="MS Gothic" w:eastAsia="MS Gothic" w:hAnsi="MS Gothic" w:cstheme="minorBidi"/>
                 <w:b/>
@@ -2080,13 +2077,8 @@
                 <w:sz w:val="22"/>
                 <w:szCs w:val="22"/>
               </w:rPr>
-              <w:lastRenderedPageBreak/>
-              <w:t>None</w:t>
-            </w:r>
-          </w:p>
-          <w:p>
-            <w:pPr>
-              <w:jc w:val="center"/>
+            </w:pPr>
+            <w:r>
               <w:rPr>
                 <w:rFonts w:ascii="MS Gothic" w:eastAsia="MS Gothic" w:hAnsi="MS Gothic" w:cstheme="minorBidi"/>
                 <w:b/>
@@ -2094,7 +2086,18 @@
                 <w:sz w:val="22"/>
                 <w:szCs w:val="22"/>
               </w:rPr>
-            </w:pPr>
+              <w:t>Alex</w:t>
+            </w:r>
+            <w:r>
+              <w:rPr>
+                <w:rFonts w:ascii="MS Gothic" w:eastAsia="MS Gothic" w:hAnsi="MS Gothic" w:cstheme="minorBidi"/>
+                <w:b/>
+                <w:bCs/>
+                <w:sz w:val="22"/>
+                <w:szCs w:val="22"/>
+              </w:rPr>
+              <w:t xml:space="preserve"> </w:t>
+            </w:r>
           </w:p>
         </w:tc>
       </w:tr>
@@ -2111,7 +2114,7 @@
               <w:pStyle w:val="ListParagraph"/>
               <w:numPr>
                 <w:ilvl w:val="0"/>
-                <w:numId w:val="1"/>
+                <w:numId w:val="12"/>
               </w:numPr>
               <w:ind w:left="720"/>
               <w:jc w:val="both"/>
@@ -2171,6 +2174,16 @@
                 <w:szCs w:val="22"/>
               </w:rPr>
             </w:pPr>
+            <w:r>
+              <w:rPr>
+                <w:rFonts w:ascii="MS Gothic" w:eastAsia="MS Gothic" w:hAnsi="MS Gothic" w:cstheme="minorBidi"/>
+                <w:b/>
+                <w:bCs/>
+                <w:sz w:val="22"/>
+                <w:szCs w:val="22"/>
+              </w:rPr>
+              <w:t>Alex</w:t>
+            </w:r>
           </w:p>
         </w:tc>
       </w:tr>
@@ -2187,7 +2200,7 @@
               <w:pStyle w:val="ListParagraph"/>
               <w:numPr>
                 <w:ilvl w:val="0"/>
-                <w:numId w:val="22"/>
+                <w:numId w:val="6"/>
               </w:numPr>
               <w:spacing w:before="100" w:beforeAutospacing="1" w:after="100" w:afterAutospacing="1"/>
               <w:jc w:val="both"/>
@@ -2205,57 +2218,8 @@
                 <w:szCs w:val="23"/>
                 <w:lang w:eastAsia="en-GB"/>
               </w:rPr>
-              <w:t>7</w:t>
-            </w:r>
-            <w:r>
-              <w:rPr>
-                <w:color w:val="000000" w:themeColor="text1"/>
-                <w:sz w:val="23"/>
-                <w:szCs w:val="23"/>
-                <w:lang w:eastAsia="en-GB"/>
-              </w:rPr>
-              <w:t xml:space="preserve">. </w:t>
-            </w:r>
-            <w:r>
-              <w:rPr>
-                <w:color w:val="000000" w:themeColor="text1"/>
-                <w:sz w:val="23"/>
-                <w:szCs w:val="23"/>
-                <w:lang w:eastAsia="en-GB"/>
-              </w:rPr>
-              <w:t xml:space="preserve">Renew: </w:t>
-            </w:r>
-            <w:r>
-              <w:rPr>
-                <w:color w:val="000000" w:themeColor="text1"/>
-                <w:sz w:val="23"/>
-                <w:szCs w:val="23"/>
-                <w:lang w:eastAsia="en-GB"/>
-              </w:rPr>
-              <w:t xml:space="preserve">Renew an existing Loan. - If load exists, </w:t>
-            </w:r>
-            <w:r>
-              <w:rPr>
-                <w:color w:val="000000" w:themeColor="text1"/>
-                <w:sz w:val="23"/>
-                <w:szCs w:val="23"/>
-                <w:lang w:eastAsia="en-GB"/>
-              </w:rPr>
-              <w:t xml:space="preserve">the due date should be renewed. </w:t>
-            </w:r>
-          </w:p>
-          <w:p>
-            <w:pPr>
-              <w:pStyle w:val="ListParagraph"/>
-              <w:spacing w:before="100" w:beforeAutospacing="1" w:after="100" w:afterAutospacing="1"/>
-              <w:jc w:val="both"/>
-              <w:rPr>
-                <w:color w:val="000000" w:themeColor="text1"/>
-                <w:sz w:val="23"/>
-                <w:szCs w:val="23"/>
-                <w:lang w:eastAsia="en-GB"/>
-              </w:rPr>
-            </w:pPr>
+              <w:t>7. Renew: Renew an existing Loan. - If load exists, the due date should be renewed.</w:t>
+            </w:r>
           </w:p>
         </w:tc>
         <w:tc>
@@ -2266,8 +2230,6 @@
           <w:p>
             <w:pPr>
               <w:jc w:val="center"/>
-            </w:pPr>
-            <w:r>
               <w:rPr>
                 <w:rFonts w:ascii="MS Gothic" w:eastAsia="MS Gothic" w:hAnsi="MS Gothic" w:cstheme="minorBidi"/>
                 <w:b/>
@@ -2275,12 +2237,8 @@
                 <w:sz w:val="22"/>
                 <w:szCs w:val="22"/>
               </w:rPr>
-              <w:t>None</w:t>
-            </w:r>
-          </w:p>
-          <w:p>
-            <w:pPr>
-              <w:jc w:val="center"/>
+            </w:pPr>
+            <w:r>
               <w:rPr>
                 <w:rFonts w:ascii="MS Gothic" w:eastAsia="MS Gothic" w:hAnsi="MS Gothic" w:cstheme="minorBidi"/>
                 <w:b/>
@@ -2288,7 +2246,8 @@
                 <w:sz w:val="22"/>
                 <w:szCs w:val="22"/>
               </w:rPr>
-            </w:pPr>
+              <w:t>Alex</w:t>
+            </w:r>
           </w:p>
         </w:tc>
       </w:tr>
@@ -2305,7 +2264,7 @@
               <w:pStyle w:val="ListParagraph"/>
               <w:numPr>
                 <w:ilvl w:val="0"/>
-                <w:numId w:val="22"/>
+                <w:numId w:val="6"/>
               </w:numPr>
               <w:autoSpaceDE w:val="0"/>
               <w:autoSpaceDN w:val="0"/>
@@ -2390,17 +2349,24 @@
               </w:rPr>
               <w:t xml:space="preserve"> (via “</w:t>
             </w:r>
-            <w:proofErr w:type="spellStart"/>
-            <w:r>
-              <w:rPr>
-                <w:color w:val="000000" w:themeColor="text1"/>
-                <w:sz w:val="23"/>
-                <w:szCs w:val="23"/>
-                <w:lang w:eastAsia="en-GB"/>
-              </w:rPr>
-              <w:t>eixt</w:t>
-            </w:r>
-            <w:proofErr w:type="spellEnd"/>
+            <w:r>
+              <w:rPr>
+                <w:color w:val="000000" w:themeColor="text1"/>
+                <w:sz w:val="23"/>
+                <w:szCs w:val="23"/>
+                <w:lang w:eastAsia="en-GB"/>
+              </w:rPr>
+              <w:t>exit</w:t>
+            </w:r>
+            <w:r>
+              <w:rPr>
+                <w:color w:val="000000" w:themeColor="text1"/>
+                <w:sz w:val="23"/>
+                <w:szCs w:val="23"/>
+                <w:lang w:eastAsia="en-GB"/>
+              </w:rPr>
+              <w:t>exit</w:t>
+            </w:r>
             <w:r>
               <w:rPr>
                 <w:color w:val="000000" w:themeColor="text1"/>
@@ -2467,8 +2433,6 @@
           <w:p>
             <w:pPr>
               <w:jc w:val="center"/>
-            </w:pPr>
-            <w:r>
               <w:rPr>
                 <w:rFonts w:ascii="MS Gothic" w:eastAsia="MS Gothic" w:hAnsi="MS Gothic" w:cstheme="minorBidi"/>
                 <w:b/>
@@ -2476,12 +2440,8 @@
                 <w:sz w:val="22"/>
                 <w:szCs w:val="22"/>
               </w:rPr>
-              <w:t>None</w:t>
-            </w:r>
-          </w:p>
-          <w:p>
-            <w:pPr>
-              <w:jc w:val="center"/>
+            </w:pPr>
+            <w:r>
               <w:rPr>
                 <w:rFonts w:ascii="MS Gothic" w:eastAsia="MS Gothic" w:hAnsi="MS Gothic" w:cstheme="minorBidi"/>
                 <w:b/>
@@ -2489,7 +2449,18 @@
                 <w:sz w:val="22"/>
                 <w:szCs w:val="22"/>
               </w:rPr>
-            </w:pPr>
+              <w:t>Alex</w:t>
+            </w:r>
+            <w:r>
+              <w:rPr>
+                <w:rFonts w:ascii="MS Gothic" w:eastAsia="MS Gothic" w:hAnsi="MS Gothic" w:cstheme="minorBidi"/>
+                <w:b/>
+                <w:bCs/>
+                <w:sz w:val="22"/>
+                <w:szCs w:val="22"/>
+              </w:rPr>
+              <w:t xml:space="preserve"> </w:t>
+            </w:r>
           </w:p>
         </w:tc>
       </w:tr>
@@ -2571,7 +2542,7 @@
               <w:pStyle w:val="ListParagraph"/>
               <w:numPr>
                 <w:ilvl w:val="0"/>
-                <w:numId w:val="10"/>
+                <w:numId w:val="14"/>
               </w:numPr>
               <w:autoSpaceDE w:val="0"/>
               <w:autoSpaceDN w:val="0"/>
@@ -2630,16 +2601,22 @@
           <w:p>
             <w:pPr>
               <w:jc w:val="center"/>
-            </w:pPr>
-            <w:r>
-              <w:rPr>
-                <w:rFonts w:ascii="MS Gothic" w:eastAsia="MS Gothic" w:hAnsi="MS Gothic" w:cstheme="minorBidi"/>
-                <w:b/>
-                <w:bCs/>
-                <w:sz w:val="22"/>
-                <w:szCs w:val="22"/>
-              </w:rPr>
-              <w:t>None</w:t>
+              <w:rPr>
+                <w:rFonts w:ascii="MS Gothic" w:eastAsia="MS Gothic" w:hAnsi="MS Gothic" w:cs="MS Gothic"/>
+                <w:sz w:val="22"/>
+                <w:szCs w:val="22"/>
+              </w:rPr>
+            </w:pPr>
+            <w:r>
+              <w:rPr>
+                <w:rFonts w:ascii="MS Gothic" w:eastAsia="MS Gothic" w:hAnsi="MS Gothic" w:cs="MS Gothic"/>
+                <w:b/>
+                <w:bCs/>
+                <w:color w:val="000000" w:themeColor="text1"/>
+                <w:sz w:val="22"/>
+                <w:szCs w:val="22"/>
+              </w:rPr>
+              <w:t>Alex</w:t>
             </w:r>
           </w:p>
           <w:p>
@@ -2669,7 +2646,7 @@
               <w:pStyle w:val="ListParagraph"/>
               <w:numPr>
                 <w:ilvl w:val="0"/>
-                <w:numId w:val="22"/>
+                <w:numId w:val="6"/>
               </w:numPr>
               <w:autoSpaceDE w:val="0"/>
               <w:autoSpaceDN w:val="0"/>
@@ -2748,8 +2725,27 @@
           <w:p>
             <w:pPr>
               <w:jc w:val="center"/>
-            </w:pPr>
-            <w:r>
+              <w:rPr>
+                <w:rFonts w:ascii="MS Gothic" w:eastAsia="MS Gothic" w:hAnsi="MS Gothic" w:cs="MS Gothic"/>
+                <w:sz w:val="22"/>
+                <w:szCs w:val="22"/>
+              </w:rPr>
+            </w:pPr>
+            <w:r>
+              <w:rPr>
+                <w:rFonts w:ascii="MS Gothic" w:eastAsia="MS Gothic" w:hAnsi="MS Gothic" w:cs="MS Gothic"/>
+                <w:b/>
+                <w:bCs/>
+                <w:color w:val="000000" w:themeColor="text1"/>
+                <w:sz w:val="22"/>
+                <w:szCs w:val="22"/>
+              </w:rPr>
+              <w:t>Alex</w:t>
+            </w:r>
+          </w:p>
+          <w:p>
+            <w:pPr>
+              <w:jc w:val="center"/>
               <w:rPr>
                 <w:rFonts w:ascii="MS Gothic" w:eastAsia="MS Gothic" w:hAnsi="MS Gothic" w:cstheme="minorBidi"/>
                 <w:b/>
@@ -2757,8 +2753,7 @@
                 <w:sz w:val="22"/>
                 <w:szCs w:val="22"/>
               </w:rPr>
-              <w:t>None</w:t>
-            </w:r>
+            </w:pPr>
           </w:p>
           <w:p>
             <w:pPr>
@@ -2787,7 +2782,7 @@
               <w:pStyle w:val="ListParagraph"/>
               <w:numPr>
                 <w:ilvl w:val="0"/>
-                <w:numId w:val="22"/>
+                <w:numId w:val="6"/>
               </w:numPr>
               <w:autoSpaceDE w:val="0"/>
               <w:autoSpaceDN w:val="0"/>
@@ -2868,8 +2863,27 @@
           <w:p>
             <w:pPr>
               <w:jc w:val="center"/>
-            </w:pPr>
-            <w:r>
+              <w:rPr>
+                <w:rFonts w:ascii="MS Gothic" w:eastAsia="MS Gothic" w:hAnsi="MS Gothic" w:cs="MS Gothic"/>
+                <w:sz w:val="22"/>
+                <w:szCs w:val="22"/>
+              </w:rPr>
+            </w:pPr>
+            <w:r>
+              <w:rPr>
+                <w:rFonts w:ascii="MS Gothic" w:eastAsia="MS Gothic" w:hAnsi="MS Gothic" w:cs="MS Gothic"/>
+                <w:b/>
+                <w:bCs/>
+                <w:color w:val="000000" w:themeColor="text1"/>
+                <w:sz w:val="22"/>
+                <w:szCs w:val="22"/>
+              </w:rPr>
+              <w:t>Alex</w:t>
+            </w:r>
+          </w:p>
+          <w:p>
+            <w:pPr>
+              <w:jc w:val="center"/>
               <w:rPr>
                 <w:rFonts w:ascii="MS Gothic" w:eastAsia="MS Gothic" w:hAnsi="MS Gothic" w:cstheme="minorBidi"/>
                 <w:b/>
@@ -2877,8 +2891,7 @@
                 <w:sz w:val="22"/>
                 <w:szCs w:val="22"/>
               </w:rPr>
-              <w:t>None</w:t>
-            </w:r>
+            </w:pPr>
           </w:p>
           <w:p>
             <w:pPr>
@@ -3047,7 +3060,7 @@
               <w:pStyle w:val="ListParagraph"/>
               <w:numPr>
                 <w:ilvl w:val="0"/>
-                <w:numId w:val="22"/>
+                <w:numId w:val="6"/>
               </w:numPr>
               <w:jc w:val="both"/>
               <w:rPr>
@@ -3111,8 +3124,6 @@
           <w:p>
             <w:pPr>
               <w:jc w:val="center"/>
-            </w:pPr>
-            <w:r>
               <w:rPr>
                 <w:rFonts w:ascii="MS Gothic" w:eastAsia="MS Gothic" w:hAnsi="MS Gothic" w:cstheme="minorBidi"/>
                 <w:b/>
@@ -3120,7 +3131,16 @@
                 <w:sz w:val="22"/>
                 <w:szCs w:val="22"/>
               </w:rPr>
-              <w:t>None</w:t>
+            </w:pPr>
+            <w:r>
+              <w:rPr>
+                <w:rFonts w:ascii="MS Gothic" w:eastAsia="MS Gothic" w:hAnsi="MS Gothic" w:cstheme="minorBidi"/>
+                <w:b/>
+                <w:bCs/>
+                <w:sz w:val="22"/>
+                <w:szCs w:val="22"/>
+              </w:rPr>
+              <w:t>Orlando</w:t>
             </w:r>
           </w:p>
           <w:p>
@@ -3150,7 +3170,7 @@
               <w:pStyle w:val="ListParagraph"/>
               <w:numPr>
                 <w:ilvl w:val="0"/>
-                <w:numId w:val="22"/>
+                <w:numId w:val="6"/>
               </w:numPr>
               <w:jc w:val="both"/>
               <w:rPr>
@@ -3224,8 +3244,6 @@
           <w:p>
             <w:pPr>
               <w:jc w:val="center"/>
-            </w:pPr>
-            <w:r>
               <w:rPr>
                 <w:rFonts w:ascii="MS Gothic" w:eastAsia="MS Gothic" w:hAnsi="MS Gothic" w:cstheme="minorBidi"/>
                 <w:b/>
@@ -3233,7 +3251,16 @@
                 <w:sz w:val="22"/>
                 <w:szCs w:val="22"/>
               </w:rPr>
-              <w:t>None</w:t>
+            </w:pPr>
+            <w:r>
+              <w:rPr>
+                <w:rFonts w:ascii="MS Gothic" w:eastAsia="MS Gothic" w:hAnsi="MS Gothic" w:cstheme="minorBidi"/>
+                <w:b/>
+                <w:bCs/>
+                <w:sz w:val="22"/>
+                <w:szCs w:val="22"/>
+              </w:rPr>
+              <w:t>Orlando</w:t>
             </w:r>
           </w:p>
           <w:p>
@@ -3263,7 +3290,7 @@
               <w:pStyle w:val="ListParagraph"/>
               <w:numPr>
                 <w:ilvl w:val="0"/>
-                <w:numId w:val="22"/>
+                <w:numId w:val="6"/>
               </w:numPr>
               <w:jc w:val="both"/>
               <w:rPr>
@@ -3327,8 +3354,6 @@
           <w:p>
             <w:pPr>
               <w:jc w:val="center"/>
-            </w:pPr>
-            <w:r>
               <w:rPr>
                 <w:rFonts w:ascii="MS Gothic" w:eastAsia="MS Gothic" w:hAnsi="MS Gothic" w:cstheme="minorBidi"/>
                 <w:b/>
@@ -3336,7 +3361,16 @@
                 <w:sz w:val="22"/>
                 <w:szCs w:val="22"/>
               </w:rPr>
-              <w:t>None</w:t>
+            </w:pPr>
+            <w:r>
+              <w:rPr>
+                <w:rFonts w:ascii="MS Gothic" w:eastAsia="MS Gothic" w:hAnsi="MS Gothic" w:cstheme="minorBidi"/>
+                <w:b/>
+                <w:bCs/>
+                <w:sz w:val="22"/>
+                <w:szCs w:val="22"/>
+              </w:rPr>
+              <w:t>Orlando</w:t>
             </w:r>
           </w:p>
           <w:p>
@@ -3366,7 +3400,7 @@
               <w:pStyle w:val="ListParagraph"/>
               <w:numPr>
                 <w:ilvl w:val="0"/>
-                <w:numId w:val="22"/>
+                <w:numId w:val="6"/>
               </w:numPr>
               <w:jc w:val="both"/>
               <w:rPr>
@@ -3430,8 +3464,6 @@
           <w:p>
             <w:pPr>
               <w:jc w:val="center"/>
-            </w:pPr>
-            <w:r>
               <w:rPr>
                 <w:rFonts w:ascii="MS Gothic" w:eastAsia="MS Gothic" w:hAnsi="MS Gothic" w:cstheme="minorBidi"/>
                 <w:b/>
@@ -3439,7 +3471,16 @@
                 <w:sz w:val="22"/>
                 <w:szCs w:val="22"/>
               </w:rPr>
-              <w:t>None</w:t>
+            </w:pPr>
+            <w:r>
+              <w:rPr>
+                <w:rFonts w:ascii="MS Gothic" w:eastAsia="MS Gothic" w:hAnsi="MS Gothic" w:cstheme="minorBidi"/>
+                <w:b/>
+                <w:bCs/>
+                <w:sz w:val="22"/>
+                <w:szCs w:val="22"/>
+              </w:rPr>
+              <w:t>Orlando</w:t>
             </w:r>
           </w:p>
           <w:p>
@@ -3469,7 +3510,7 @@
               <w:pStyle w:val="ListParagraph"/>
               <w:numPr>
                 <w:ilvl w:val="0"/>
-                <w:numId w:val="22"/>
+                <w:numId w:val="6"/>
               </w:numPr>
               <w:autoSpaceDE w:val="0"/>
               <w:autoSpaceDN w:val="0"/>
@@ -3511,29 +3552,7 @@
                 <w:szCs w:val="23"/>
                 <w:lang w:eastAsia="en-GB"/>
               </w:rPr>
-              <w:t>Extend the functionality of the library system to allow for storing data to the file storage after the execution of commands that change the state of the system (e.g. “</w:t>
-            </w:r>
-            <w:proofErr w:type="spellStart"/>
-            <w:r>
-              <w:rPr>
-                <w:rFonts w:cs="Arial"/>
-                <w:color w:val="000000" w:themeColor="text1"/>
-                <w:sz w:val="23"/>
-                <w:szCs w:val="23"/>
-                <w:lang w:eastAsia="en-GB"/>
-              </w:rPr>
-              <w:t>addbook</w:t>
-            </w:r>
-            <w:proofErr w:type="spellEnd"/>
-            <w:r>
-              <w:rPr>
-                <w:rFonts w:cs="Arial"/>
-                <w:color w:val="000000" w:themeColor="text1"/>
-                <w:sz w:val="23"/>
-                <w:szCs w:val="23"/>
-                <w:lang w:eastAsia="en-GB"/>
-              </w:rPr>
-              <w:t>”, “</w:t>
+              <w:t>Extend the functionality of the library system to allow for storing data to the file storage after the execution of commands that change the state of the system (e.g. “addbook”, “</w:t>
             </w:r>
             <w:r>
               <w:rPr>
@@ -3553,18 +3572,7 @@
                 <w:szCs w:val="23"/>
                 <w:lang w:eastAsia="en-GB"/>
               </w:rPr>
-              <w:t xml:space="preserve">”). If the system fails to store the data on the file storage due to an error (e.g. file is already in used or corrupted), the program must inform the user and rollback any changes made to the system </w:t>
-            </w:r>
-            <w:r>
-              <w:rPr>
-                <w:rFonts w:cs="Arial"/>
-                <w:color w:val="000000" w:themeColor="text1"/>
-                <w:sz w:val="23"/>
-                <w:szCs w:val="23"/>
-                <w:lang w:eastAsia="en-GB"/>
-              </w:rPr>
-              <w:lastRenderedPageBreak/>
-              <w:t xml:space="preserve">prior to the error. You can change the file permission to “read-only” </w:t>
+              <w:t xml:space="preserve">”). If the system fails to store the data on the file storage due to an error (e.g. file is already in used or corrupted), the program must inform the user and rollback any changes made to the system prior to the error. You can change the file permission to “read-only” </w:t>
             </w:r>
             <w:r>
               <w:rPr>
@@ -3610,8 +3618,6 @@
           <w:p>
             <w:pPr>
               <w:jc w:val="center"/>
-            </w:pPr>
-            <w:r>
               <w:rPr>
                 <w:rFonts w:ascii="MS Gothic" w:eastAsia="MS Gothic" w:hAnsi="MS Gothic" w:cstheme="minorBidi"/>
                 <w:b/>
@@ -3619,8 +3625,16 @@
                 <w:sz w:val="22"/>
                 <w:szCs w:val="22"/>
               </w:rPr>
-              <w:lastRenderedPageBreak/>
-              <w:t>None</w:t>
+            </w:pPr>
+            <w:r>
+              <w:rPr>
+                <w:rFonts w:ascii="MS Gothic" w:eastAsia="MS Gothic" w:hAnsi="MS Gothic" w:cstheme="minorBidi"/>
+                <w:b/>
+                <w:bCs/>
+                <w:sz w:val="22"/>
+                <w:szCs w:val="22"/>
+              </w:rPr>
+              <w:t>Orlando</w:t>
             </w:r>
           </w:p>
           <w:p>
@@ -3715,7 +3729,7 @@
               <w:pStyle w:val="ListParagraph"/>
               <w:numPr>
                 <w:ilvl w:val="0"/>
-                <w:numId w:val="10"/>
+                <w:numId w:val="14"/>
               </w:numPr>
               <w:jc w:val="both"/>
               <w:rPr>
@@ -3804,8 +3818,6 @@
           <w:p>
             <w:pPr>
               <w:jc w:val="center"/>
-            </w:pPr>
-            <w:r>
               <w:rPr>
                 <w:rFonts w:ascii="MS Gothic" w:eastAsia="MS Gothic" w:hAnsi="MS Gothic" w:cstheme="minorBidi"/>
                 <w:b/>
@@ -3813,7 +3825,16 @@
                 <w:sz w:val="22"/>
                 <w:szCs w:val="22"/>
               </w:rPr>
-              <w:t>None</w:t>
+            </w:pPr>
+            <w:r>
+              <w:rPr>
+                <w:rFonts w:ascii="MS Gothic" w:eastAsia="MS Gothic" w:hAnsi="MS Gothic" w:cstheme="minorBidi"/>
+                <w:b/>
+                <w:bCs/>
+                <w:sz w:val="22"/>
+                <w:szCs w:val="22"/>
+              </w:rPr>
+              <w:t>Orlando</w:t>
             </w:r>
           </w:p>
           <w:p>
@@ -3843,7 +3864,7 @@
               <w:pStyle w:val="ListParagraph"/>
               <w:numPr>
                 <w:ilvl w:val="0"/>
-                <w:numId w:val="22"/>
+                <w:numId w:val="6"/>
               </w:numPr>
               <w:autoSpaceDE w:val="0"/>
               <w:autoSpaceDN w:val="0"/>
@@ -3885,29 +3906,7 @@
                 <w:szCs w:val="23"/>
                 <w:lang w:eastAsia="en-GB"/>
               </w:rPr>
-              <w:t xml:space="preserve">Remove (hide) existing Patrons from the system. When a patron is removed, it should not appear in the </w:t>
-            </w:r>
-            <w:proofErr w:type="gramStart"/>
-            <w:r>
-              <w:rPr>
-                <w:rFonts w:cs="Arial"/>
-                <w:color w:val="000000" w:themeColor="text1"/>
-                <w:sz w:val="23"/>
-                <w:szCs w:val="23"/>
-                <w:lang w:eastAsia="en-GB"/>
-              </w:rPr>
-              <w:t>patrons</w:t>
-            </w:r>
-            <w:proofErr w:type="gramEnd"/>
-            <w:r>
-              <w:rPr>
-                <w:rFonts w:cs="Arial"/>
-                <w:color w:val="000000" w:themeColor="text1"/>
-                <w:sz w:val="23"/>
-                <w:szCs w:val="23"/>
-                <w:lang w:eastAsia="en-GB"/>
-              </w:rPr>
-              <w:t xml:space="preserve"> view. Instead of completely deleting a patron, use a Boolean property in the Patron class to indicate that the patron is deleted. Change the affected functions appropriately to return only the books that are not deleted.</w:t>
+              <w:t>Remove (hide) existing Patrons from the system. When a patron is removed, it should not appear in the patrons view. Instead of completely deleting a patron, use a Boolean property in the Patron class to indicate that the patron is deleted. Change the affected functions appropriately to return only the books that are not deleted.</w:t>
             </w:r>
             <w:r>
               <w:rPr>
@@ -3984,8 +3983,6 @@
           <w:p>
             <w:pPr>
               <w:jc w:val="center"/>
-            </w:pPr>
-            <w:r>
               <w:rPr>
                 <w:rFonts w:ascii="MS Gothic" w:eastAsia="MS Gothic" w:hAnsi="MS Gothic" w:cstheme="minorBidi"/>
                 <w:b/>
@@ -3993,7 +3990,16 @@
                 <w:sz w:val="22"/>
                 <w:szCs w:val="22"/>
               </w:rPr>
-              <w:t>None</w:t>
+            </w:pPr>
+            <w:r>
+              <w:rPr>
+                <w:rFonts w:ascii="MS Gothic" w:eastAsia="MS Gothic" w:hAnsi="MS Gothic" w:cstheme="minorBidi"/>
+                <w:b/>
+                <w:bCs/>
+                <w:sz w:val="22"/>
+                <w:szCs w:val="22"/>
+              </w:rPr>
+              <w:t>Orlando</w:t>
             </w:r>
           </w:p>
           <w:p>
@@ -4023,7 +4029,7 @@
               <w:pStyle w:val="ListParagraph"/>
               <w:numPr>
                 <w:ilvl w:val="0"/>
-                <w:numId w:val="22"/>
+                <w:numId w:val="6"/>
               </w:numPr>
               <w:autoSpaceDE w:val="0"/>
               <w:autoSpaceDN w:val="0"/>
@@ -4125,8 +4131,6 @@
           <w:p>
             <w:pPr>
               <w:jc w:val="center"/>
-            </w:pPr>
-            <w:r>
               <w:rPr>
                 <w:rFonts w:ascii="MS Gothic" w:eastAsia="MS Gothic" w:hAnsi="MS Gothic" w:cstheme="minorBidi"/>
                 <w:b/>
@@ -4134,7 +4138,16 @@
                 <w:sz w:val="22"/>
                 <w:szCs w:val="22"/>
               </w:rPr>
-              <w:t>None</w:t>
+            </w:pPr>
+            <w:r>
+              <w:rPr>
+                <w:rFonts w:ascii="MS Gothic" w:eastAsia="MS Gothic" w:hAnsi="MS Gothic" w:cstheme="minorBidi"/>
+                <w:b/>
+                <w:bCs/>
+                <w:sz w:val="22"/>
+                <w:szCs w:val="22"/>
+              </w:rPr>
+              <w:t>Orlando</w:t>
             </w:r>
           </w:p>
           <w:p>
@@ -4164,7 +4177,7 @@
               <w:pStyle w:val="ListParagraph"/>
               <w:numPr>
                 <w:ilvl w:val="0"/>
-                <w:numId w:val="22"/>
+                <w:numId w:val="6"/>
               </w:numPr>
               <w:autoSpaceDE w:val="0"/>
               <w:autoSpaceDN w:val="0"/>
@@ -4226,8 +4239,6 @@
           <w:p>
             <w:pPr>
               <w:jc w:val="center"/>
-            </w:pPr>
-            <w:r>
               <w:rPr>
                 <w:rFonts w:ascii="MS Gothic" w:eastAsia="MS Gothic" w:hAnsi="MS Gothic" w:cstheme="minorBidi"/>
                 <w:b/>
@@ -4235,7 +4246,16 @@
                 <w:sz w:val="22"/>
                 <w:szCs w:val="22"/>
               </w:rPr>
-              <w:t>None</w:t>
+            </w:pPr>
+            <w:r>
+              <w:rPr>
+                <w:rFonts w:ascii="MS Gothic" w:eastAsia="MS Gothic" w:hAnsi="MS Gothic" w:cstheme="minorBidi"/>
+                <w:b/>
+                <w:bCs/>
+                <w:sz w:val="22"/>
+                <w:szCs w:val="22"/>
+              </w:rPr>
+              <w:t>Orlando</w:t>
             </w:r>
           </w:p>
           <w:p>
@@ -4265,7 +4285,7 @@
               <w:pStyle w:val="ListParagraph"/>
               <w:numPr>
                 <w:ilvl w:val="0"/>
-                <w:numId w:val="22"/>
+                <w:numId w:val="6"/>
               </w:numPr>
               <w:autoSpaceDE w:val="0"/>
               <w:autoSpaceDN w:val="0"/>
@@ -4388,8 +4408,6 @@
           <w:p>
             <w:pPr>
               <w:jc w:val="center"/>
-            </w:pPr>
-            <w:r>
               <w:rPr>
                 <w:rFonts w:ascii="MS Gothic" w:eastAsia="MS Gothic" w:hAnsi="MS Gothic" w:cstheme="minorBidi"/>
                 <w:b/>
@@ -4397,7 +4415,16 @@
                 <w:sz w:val="22"/>
                 <w:szCs w:val="22"/>
               </w:rPr>
-              <w:t>None</w:t>
+            </w:pPr>
+            <w:r>
+              <w:rPr>
+                <w:rFonts w:ascii="MS Gothic" w:eastAsia="MS Gothic" w:hAnsi="MS Gothic" w:cstheme="minorBidi"/>
+                <w:b/>
+                <w:bCs/>
+                <w:sz w:val="22"/>
+                <w:szCs w:val="22"/>
+              </w:rPr>
+              <w:t>Orlando</w:t>
             </w:r>
           </w:p>
           <w:p>
@@ -4537,7 +4564,7 @@
               <w:pStyle w:val="ListParagraph"/>
               <w:numPr>
                 <w:ilvl w:val="0"/>
-                <w:numId w:val="10"/>
+                <w:numId w:val="14"/>
               </w:numPr>
               <w:autoSpaceDE w:val="0"/>
               <w:autoSpaceDN w:val="0"/>
@@ -4641,8 +4668,6 @@
           <w:p>
             <w:pPr>
               <w:jc w:val="center"/>
-            </w:pPr>
-            <w:r>
               <w:rPr>
                 <w:rFonts w:ascii="MS Gothic" w:eastAsia="MS Gothic" w:hAnsi="MS Gothic" w:cstheme="minorBidi"/>
                 <w:b/>
@@ -4650,12 +4675,8 @@
                 <w:sz w:val="22"/>
                 <w:szCs w:val="22"/>
               </w:rPr>
-              <w:t>None</w:t>
-            </w:r>
-          </w:p>
-          <w:p>
-            <w:pPr>
-              <w:jc w:val="center"/>
+            </w:pPr>
+            <w:r>
               <w:rPr>
                 <w:rFonts w:ascii="MS Gothic" w:eastAsia="MS Gothic" w:hAnsi="MS Gothic" w:cstheme="minorBidi"/>
                 <w:b/>
@@ -4663,7 +4684,18 @@
                 <w:sz w:val="22"/>
                 <w:szCs w:val="22"/>
               </w:rPr>
-            </w:pPr>
+              <w:t>Alex</w:t>
+            </w:r>
+            <w:r>
+              <w:rPr>
+                <w:rFonts w:ascii="MS Gothic" w:eastAsia="MS Gothic" w:hAnsi="MS Gothic" w:cstheme="minorBidi"/>
+                <w:b/>
+                <w:bCs/>
+                <w:sz w:val="22"/>
+                <w:szCs w:val="22"/>
+              </w:rPr>
+              <w:t xml:space="preserve"> </w:t>
+            </w:r>
           </w:p>
         </w:tc>
       </w:tr>
@@ -4680,7 +4712,7 @@
               <w:pStyle w:val="ListParagraph"/>
               <w:numPr>
                 <w:ilvl w:val="0"/>
-                <w:numId w:val="10"/>
+                <w:numId w:val="14"/>
               </w:numPr>
               <w:autoSpaceDE w:val="0"/>
               <w:autoSpaceDN w:val="0"/>
@@ -4769,6 +4801,13 @@
           <w:p>
             <w:pPr>
               <w:jc w:val="center"/>
+              <w:rPr>
+                <w:rFonts w:asciiTheme="minorBidi" w:hAnsiTheme="minorBidi" w:cstheme="minorBidi"/>
+                <w:b/>
+                <w:bCs/>
+                <w:sz w:val="22"/>
+                <w:szCs w:val="22"/>
+              </w:rPr>
             </w:pPr>
             <w:r>
               <w:rPr>
@@ -4778,12 +4817,9 @@
                 <w:sz w:val="22"/>
                 <w:szCs w:val="22"/>
               </w:rPr>
-              <w:t>None</w:t>
-            </w:r>
-          </w:p>
-          <w:p>
-            <w:pPr>
-              <w:jc w:val="center"/>
+              <w:t>Alex</w:t>
+            </w:r>
+            <w:r>
               <w:rPr>
                 <w:rFonts w:asciiTheme="minorBidi" w:hAnsiTheme="minorBidi" w:cstheme="minorBidi"/>
                 <w:b/>
@@ -4791,7 +4827,8 @@
                 <w:sz w:val="22"/>
                 <w:szCs w:val="22"/>
               </w:rPr>
-            </w:pPr>
+              <w:t xml:space="preserve"> </w:t>
+            </w:r>
           </w:p>
         </w:tc>
       </w:tr>
@@ -4808,7 +4845,7 @@
               <w:pStyle w:val="ListParagraph"/>
               <w:numPr>
                 <w:ilvl w:val="0"/>
-                <w:numId w:val="10"/>
+                <w:numId w:val="14"/>
               </w:numPr>
               <w:jc w:val="both"/>
               <w:rPr>
@@ -4882,6 +4919,13 @@
           <w:p>
             <w:pPr>
               <w:jc w:val="center"/>
+              <w:rPr>
+                <w:rFonts w:asciiTheme="minorBidi" w:hAnsiTheme="minorBidi" w:cstheme="minorBidi"/>
+                <w:b/>
+                <w:bCs/>
+                <w:sz w:val="22"/>
+                <w:szCs w:val="22"/>
+              </w:rPr>
             </w:pPr>
             <w:r>
               <w:rPr>
@@ -4891,12 +4935,9 @@
                 <w:sz w:val="22"/>
                 <w:szCs w:val="22"/>
               </w:rPr>
-              <w:t>None</w:t>
-            </w:r>
-          </w:p>
-          <w:p>
-            <w:pPr>
-              <w:jc w:val="center"/>
+              <w:t>Alex</w:t>
+            </w:r>
+            <w:r>
               <w:rPr>
                 <w:rFonts w:asciiTheme="minorBidi" w:hAnsiTheme="minorBidi" w:cstheme="minorBidi"/>
                 <w:b/>
@@ -4904,7 +4945,8 @@
                 <w:sz w:val="22"/>
                 <w:szCs w:val="22"/>
               </w:rPr>
-            </w:pPr>
+              <w:t xml:space="preserve"> </w:t>
+            </w:r>
           </w:p>
         </w:tc>
       </w:tr>
@@ -4921,7 +4963,7 @@
               <w:pStyle w:val="ListParagraph"/>
               <w:numPr>
                 <w:ilvl w:val="0"/>
-                <w:numId w:val="10"/>
+                <w:numId w:val="14"/>
               </w:numPr>
               <w:jc w:val="both"/>
               <w:rPr>
@@ -4984,6 +5026,13 @@
           <w:p>
             <w:pPr>
               <w:jc w:val="center"/>
+              <w:rPr>
+                <w:rFonts w:asciiTheme="minorBidi" w:hAnsiTheme="minorBidi" w:cstheme="minorBidi"/>
+                <w:b/>
+                <w:bCs/>
+                <w:sz w:val="22"/>
+                <w:szCs w:val="22"/>
+              </w:rPr>
             </w:pPr>
             <w:r>
               <w:rPr>
@@ -4993,12 +5042,9 @@
                 <w:sz w:val="22"/>
                 <w:szCs w:val="22"/>
               </w:rPr>
-              <w:t>None</w:t>
-            </w:r>
-          </w:p>
-          <w:p>
-            <w:pPr>
-              <w:jc w:val="center"/>
+              <w:t>Alex</w:t>
+            </w:r>
+            <w:r>
               <w:rPr>
                 <w:rFonts w:asciiTheme="minorBidi" w:hAnsiTheme="minorBidi" w:cstheme="minorBidi"/>
                 <w:b/>
@@ -5006,7 +5052,8 @@
                 <w:sz w:val="22"/>
                 <w:szCs w:val="22"/>
               </w:rPr>
-            </w:pPr>
+              <w:t xml:space="preserve"> </w:t>
+            </w:r>
           </w:p>
         </w:tc>
       </w:tr>
@@ -7188,71 +7235,71 @@
       </w:pPr>
     </w:lvl>
   </w:abstractNum>
-  <w:num w:numId="1" w16cid:durableId="2037809091">
-    <w:abstractNumId w:val="10"/>
+  <w:num w:numId="1" w16cid:durableId="1035468803">
+    <w:abstractNumId w:val="14"/>
   </w:num>
-  <w:num w:numId="2" w16cid:durableId="1219903888">
+  <w:num w:numId="2" w16cid:durableId="1114054745">
+    <w:abstractNumId w:val="21"/>
+  </w:num>
+  <w:num w:numId="3" w16cid:durableId="1150710389">
+    <w:abstractNumId w:val="16"/>
+  </w:num>
+  <w:num w:numId="4" w16cid:durableId="1219903888">
     <w:abstractNumId w:val="4"/>
   </w:num>
-  <w:num w:numId="3" w16cid:durableId="204997815">
-    <w:abstractNumId w:val="17"/>
-  </w:num>
-  <w:num w:numId="4" w16cid:durableId="868223552">
-    <w:abstractNumId w:val="15"/>
-  </w:num>
-  <w:num w:numId="5" w16cid:durableId="1114054745">
-    <w:abstractNumId w:val="21"/>
-  </w:num>
-  <w:num w:numId="6" w16cid:durableId="983778204">
-    <w:abstractNumId w:val="3"/>
-  </w:num>
-  <w:num w:numId="7" w16cid:durableId="141585405">
+  <w:num w:numId="5" w16cid:durableId="141585405">
     <w:abstractNumId w:val="18"/>
   </w:num>
-  <w:num w:numId="8" w16cid:durableId="327834525">
-    <w:abstractNumId w:val="0"/>
+  <w:num w:numId="6" w16cid:durableId="1442914328">
+    <w:abstractNumId w:val="13"/>
+  </w:num>
+  <w:num w:numId="7" w16cid:durableId="1580215432">
+    <w:abstractNumId w:val="6"/>
+  </w:num>
+  <w:num w:numId="8" w16cid:durableId="1637637072">
+    <w:abstractNumId w:val="5"/>
   </w:num>
   <w:num w:numId="9" w16cid:durableId="1686441648">
     <w:abstractNumId w:val="2"/>
   </w:num>
-  <w:num w:numId="10" w16cid:durableId="2059041420">
+  <w:num w:numId="10" w16cid:durableId="1785080340">
+    <w:abstractNumId w:val="12"/>
+  </w:num>
+  <w:num w:numId="11" w16cid:durableId="1876119818">
+    <w:abstractNumId w:val="7"/>
+  </w:num>
+  <w:num w:numId="12" w16cid:durableId="2037809091">
+    <w:abstractNumId w:val="10"/>
+  </w:num>
+  <w:num w:numId="13" w16cid:durableId="204997815">
+    <w:abstractNumId w:val="17"/>
+  </w:num>
+  <w:num w:numId="14" w16cid:durableId="2059041420">
     <w:abstractNumId w:val="8"/>
   </w:num>
-  <w:num w:numId="11" w16cid:durableId="1637637072">
-    <w:abstractNumId w:val="5"/>
+  <w:num w:numId="15" w16cid:durableId="327834525">
+    <w:abstractNumId w:val="0"/>
   </w:num>
-  <w:num w:numId="12" w16cid:durableId="1785080340">
-    <w:abstractNumId w:val="12"/>
+  <w:num w:numId="16" w16cid:durableId="545409507">
+    <w:abstractNumId w:val="19"/>
   </w:num>
-  <w:num w:numId="13" w16cid:durableId="643971581">
+  <w:num w:numId="17" w16cid:durableId="643971581">
     <w:abstractNumId w:val="20"/>
   </w:num>
-  <w:num w:numId="14" w16cid:durableId="863786889">
+  <w:num w:numId="18" w16cid:durableId="77950427">
+    <w:abstractNumId w:val="9"/>
+  </w:num>
+  <w:num w:numId="19" w16cid:durableId="838076616">
+    <w:abstractNumId w:val="1"/>
+  </w:num>
+  <w:num w:numId="20" w16cid:durableId="863786889">
     <w:abstractNumId w:val="11"/>
   </w:num>
-  <w:num w:numId="15" w16cid:durableId="77950427">
-    <w:abstractNumId w:val="9"/>
+  <w:num w:numId="21" w16cid:durableId="868223552">
+    <w:abstractNumId w:val="15"/>
   </w:num>
-  <w:num w:numId="16" w16cid:durableId="1150710389">
-    <w:abstractNumId w:val="16"/>
-  </w:num>
-  <w:num w:numId="17" w16cid:durableId="1035468803">
-    <w:abstractNumId w:val="14"/>
-  </w:num>
-  <w:num w:numId="18" w16cid:durableId="545409507">
-    <w:abstractNumId w:val="19"/>
-  </w:num>
-  <w:num w:numId="19" w16cid:durableId="1876119818">
-    <w:abstractNumId w:val="7"/>
-  </w:num>
-  <w:num w:numId="20" w16cid:durableId="1580215432">
-    <w:abstractNumId w:val="6"/>
-  </w:num>
-  <w:num w:numId="21" w16cid:durableId="838076616">
-    <w:abstractNumId w:val="1"/>
-  </w:num>
-  <w:num w:numId="22" w16cid:durableId="1442914328">
-    <w:abstractNumId w:val="13"/>
+  <w:num w:numId="22" w16cid:durableId="983778204">
+    <w:abstractNumId w:val="3"/>
   </w:num>
 </w:numbering>
 </file>
@@ -7668,7 +7715,6 @@
   <w:style w:type="character" w:default="1" w:styleId="DefaultParagraphFont">
     <w:name w:val="Default Paragraph Font"/>
     <w:uiPriority w:val="1"/>
-    <w:semiHidden/>
     <w:unhideWhenUsed/>
   </w:style>
   <w:style w:type="table" w:default="1" w:styleId="TableNormal">

</xml_diff>

<commit_message>
2nd year Project - Initial Commit
</commit_message>
<xml_diff>
--- a/Object Oriented Programming/Assignment/[CMP5332 OOP] Library System - Feature and Responsibility Checklist.docx
+++ b/Object Oriented Programming/Assignment/[CMP5332 OOP] Library System - Feature and Responsibility Checklist.docx
@@ -1,6 +1,6 @@
 
 <file path=word/document.xml><?xml version="1.0" encoding="utf-8"?>
-<w:document xmlns:wpc="http://schemas.microsoft.com/office/word/2010/wordprocessingCanvas" xmlns:cx="http://schemas.microsoft.com/office/drawing/2014/chartex" xmlns:cx1="http://schemas.microsoft.com/office/drawing/2015/9/8/chartex" xmlns:cx2="http://schemas.microsoft.com/office/drawing/2015/10/21/chartex" xmlns:cx3="http://schemas.microsoft.com/office/drawing/2016/5/9/chartex" xmlns:cx4="http://schemas.microsoft.com/office/drawing/2016/5/10/chartex" xmlns:cx5="http://schemas.microsoft.com/office/drawing/2016/5/11/chartex" xmlns:cx6="http://schemas.microsoft.com/office/drawing/2016/5/12/chartex" xmlns:cx7="http://schemas.microsoft.com/office/drawing/2016/5/13/chartex" xmlns:cx8="http://schemas.microsoft.com/office/drawing/2016/5/14/chartex" xmlns:mc="http://schemas.openxmlformats.org/markup-compatibility/2006" xmlns:aink="http://schemas.microsoft.com/office/drawing/2016/ink" xmlns:am3d="http://schemas.microsoft.com/office/drawing/2017/model3d" xmlns:o="urn:schemas-microsoft-com:office:office" xmlns:oel="http://schemas.microsoft.com/office/2019/extlst" xmlns:r="http://schemas.openxmlformats.org/officeDocument/2006/relationships" xmlns:m="http://schemas.openxmlformats.org/officeDocument/2006/math" xmlns:v="urn:schemas-microsoft-com:vml" xmlns:wp14="http://schemas.microsoft.com/office/word/2010/wordprocessingDrawing" xmlns:wp="http://schemas.openxmlformats.org/drawingml/2006/wordprocessingDrawing" xmlns:w10="urn:schemas-microsoft-com:office:word" xmlns:w="http://schemas.openxmlformats.org/wordprocessingml/2006/main" xmlns:w14="http://schemas.microsoft.com/office/word/2010/wordml" xmlns:w15="http://schemas.microsoft.com/office/word/2012/wordml" xmlns:w16cex="http://schemas.microsoft.com/office/word/2018/wordml/cex" xmlns:w16cid="http://schemas.microsoft.com/office/word/2016/wordml/cid" xmlns:w16="http://schemas.microsoft.com/office/word/2018/wordml" xmlns:w16du="http://schemas.microsoft.com/office/word/2023/wordml/word16du" xmlns:w16sdtdh="http://schemas.microsoft.com/office/word/2020/wordml/sdtdatahash" xmlns:w16sdtfl="http://schemas.microsoft.com/office/word/2024/wordml/sdtformatlock" xmlns:w16se="http://schemas.microsoft.com/office/word/2015/wordml/symex" xmlns:wpg="http://schemas.microsoft.com/office/word/2010/wordprocessingGroup" xmlns:wpi="http://schemas.microsoft.com/office/word/2010/wordprocessingInk" xmlns:wne="http://schemas.microsoft.com/office/word/2006/wordml" xmlns:wps="http://schemas.microsoft.com/office/word/2010/wordprocessingShape" mc:Ignorable="w14 w15 w16se w16cid w16 w16cex w16sdtdh w16sdtfl w16du wp14">
+<w:document xmlns:wpc="http://schemas.microsoft.com/office/word/2010/wordprocessingCanvas" xmlns:cx="http://schemas.microsoft.com/office/drawing/2014/chartex" xmlns:cx1="http://schemas.microsoft.com/office/drawing/2015/9/8/chartex" xmlns:cx2="http://schemas.microsoft.com/office/drawing/2015/10/21/chartex" xmlns:cx3="http://schemas.microsoft.com/office/drawing/2016/5/9/chartex" xmlns:cx4="http://schemas.microsoft.com/office/drawing/2016/5/10/chartex" xmlns:cx5="http://schemas.microsoft.com/office/drawing/2016/5/11/chartex" xmlns:cx6="http://schemas.microsoft.com/office/drawing/2016/5/12/chartex" xmlns:cx7="http://schemas.microsoft.com/office/drawing/2016/5/13/chartex" xmlns:cx8="http://schemas.microsoft.com/office/drawing/2016/5/14/chartex" xmlns:mc="http://schemas.openxmlformats.org/markup-compatibility/2006" xmlns:aink="http://schemas.microsoft.com/office/drawing/2016/ink" xmlns:am3d="http://schemas.microsoft.com/office/drawing/2017/model3d" xmlns:o="urn:schemas-microsoft-com:office:office" xmlns:oel="http://schemas.microsoft.com/office/2019/extlst" xmlns:r="http://schemas.openxmlformats.org/officeDocument/2006/relationships" xmlns:m="http://schemas.openxmlformats.org/officeDocument/2006/math" xmlns:v="urn:schemas-microsoft-com:vml" xmlns:wp14="http://schemas.microsoft.com/office/word/2010/wordprocessingDrawing" xmlns:wp="http://schemas.openxmlformats.org/drawingml/2006/wordprocessingDrawing" xmlns:w10="urn:schemas-microsoft-com:office:word" xmlns:w="http://schemas.openxmlformats.org/wordprocessingml/2006/main" xmlns:w14="http://schemas.microsoft.com/office/word/2010/wordml" xmlns:w15="http://schemas.microsoft.com/office/word/2012/wordml" xmlns:w16cex="http://schemas.microsoft.com/office/word/2018/wordml/cex" xmlns:w16cid="http://schemas.microsoft.com/office/word/2016/wordml/cid" xmlns:w16="http://schemas.microsoft.com/office/word/2018/wordml" xmlns:w16du="http://schemas.microsoft.com/office/word/2023/wordml/word16du" xmlns:w16sdtdh="http://schemas.microsoft.com/office/word/2020/wordml/sdtdatahash" xmlns:w16sdtfl="http://schemas.microsoft.com/office/word/2024/wordml/sdtformatlock" xmlns:w16se="http://schemas.microsoft.com/office/word/2015/wordml/symex" xmlns:wpg="http://schemas.microsoft.com/office/word/2010/wordprocessingGroup" xmlns:wpi="http://schemas.microsoft.com/office/word/2010/wordprocessingInk" xmlns:wne="http://schemas.microsoft.com/office/word/2006/wordml" xmlns:wps="http://schemas.microsoft.com/office/word/2010/wordprocessingShape" xmlns:a="http://schemas.openxmlformats.org/drawingml/2006/main" xmlns:a16="http://schemas.microsoft.com/office/drawing/2014/main" xmlns:pic="http://schemas.openxmlformats.org/drawingml/2006/picture" mc:Ignorable="w14 w15 w16se w16cid w16 w16cex w16sdtdh w16sdtfl w16du wp14">
   <w:body>
     <w:tbl>
       <w:tblPr>
@@ -26,7 +26,7 @@
           <w:tcPr>
             <w:tcW w:w="2679" w:type="dxa"/>
             <w:tcBorders>
-              <w:right w:val="single" w:sz="4" w:space="0" w:color="00000A"/>
+              <w:right w:val="single" w:color="00000A" w:sz="4" w:space="0"/>
             </w:tcBorders>
             <w:shd w:val="clear" w:color="auto" w:fill="FFFFFF"/>
             <w:tcMar>
@@ -80,8 +80,8 @@
           <w:tcPr>
             <w:tcW w:w="5147" w:type="dxa"/>
             <w:tcBorders>
-              <w:left w:val="single" w:sz="4" w:space="0" w:color="00000A"/>
-              <w:right w:val="single" w:sz="4" w:space="0" w:color="00000A"/>
+              <w:left w:val="single" w:color="00000A" w:sz="4" w:space="0"/>
+              <w:right w:val="single" w:color="00000A" w:sz="4" w:space="0"/>
             </w:tcBorders>
             <w:shd w:val="clear" w:color="auto" w:fill="FFFFFF"/>
             <w:tcMar>
@@ -119,6 +119,14 @@
                 <w:szCs w:val="22"/>
               </w:rPr>
               <w:br/>
+            </w:r>
+            <w:r>
+              <w:rPr>
+                <w:rFonts w:ascii="Arial" w:hAnsi="Arial" w:cs="Arial"/>
+                <w:b/>
+                <w:sz w:val="22"/>
+                <w:szCs w:val="22"/>
+              </w:rPr>
               <w:t>and the Built Environment</w:t>
             </w:r>
           </w:p>
@@ -127,8 +135,8 @@
           <w:tcPr>
             <w:tcW w:w="2835" w:type="dxa"/>
             <w:tcBorders>
-              <w:left w:val="single" w:sz="4" w:space="0" w:color="00000A"/>
-              <w:right w:val="single" w:sz="4" w:space="0" w:color="00000A"/>
+              <w:left w:val="single" w:color="00000A" w:sz="4" w:space="0"/>
+              <w:right w:val="single" w:color="00000A" w:sz="4" w:space="0"/>
             </w:tcBorders>
             <w:shd w:val="clear" w:color="auto" w:fill="FFFFFF"/>
             <w:tcMar>
@@ -240,10 +248,10 @@
             <w:tcW w:w="10272" w:type="dxa"/>
             <w:gridSpan w:val="4"/>
             <w:tcBorders>
-              <w:top w:val="single" w:sz="4" w:space="0" w:color="00000A"/>
-              <w:left w:val="single" w:sz="4" w:space="0" w:color="00000A"/>
-              <w:bottom w:val="single" w:sz="4" w:space="0" w:color="00000A"/>
-              <w:right w:val="single" w:sz="4" w:space="0" w:color="00000A"/>
+              <w:top w:val="single" w:color="00000A" w:sz="4" w:space="0"/>
+              <w:left w:val="single" w:color="00000A" w:sz="4" w:space="0"/>
+              <w:bottom w:val="single" w:color="00000A" w:sz="4" w:space="0"/>
+              <w:right w:val="single" w:color="00000A" w:sz="4" w:space="0"/>
             </w:tcBorders>
             <w:shd w:val="clear" w:color="auto" w:fill="FFFFFF" w:themeFill="background1"/>
             <w:tcMar>
@@ -294,10 +302,10 @@
           <w:tcPr>
             <w:tcW w:w="2173" w:type="dxa"/>
             <w:tcBorders>
-              <w:top w:val="single" w:sz="4" w:space="0" w:color="00000A"/>
-              <w:left w:val="single" w:sz="4" w:space="0" w:color="00000A"/>
-              <w:bottom w:val="single" w:sz="4" w:space="0" w:color="00000A"/>
-              <w:right w:val="single" w:sz="4" w:space="0" w:color="00000A"/>
+              <w:top w:val="single" w:color="00000A" w:sz="4" w:space="0"/>
+              <w:left w:val="single" w:color="00000A" w:sz="4" w:space="0"/>
+              <w:bottom w:val="single" w:color="00000A" w:sz="4" w:space="0"/>
+              <w:right w:val="single" w:color="00000A" w:sz="4" w:space="0"/>
             </w:tcBorders>
             <w:shd w:val="clear" w:color="auto" w:fill="D0CECE" w:themeFill="background2" w:themeFillShade="E6"/>
             <w:tcMar>
@@ -335,10 +343,10 @@
           <w:tcPr>
             <w:tcW w:w="2677" w:type="dxa"/>
             <w:tcBorders>
-              <w:top w:val="single" w:sz="4" w:space="0" w:color="00000A"/>
-              <w:left w:val="single" w:sz="4" w:space="0" w:color="00000A"/>
-              <w:bottom w:val="single" w:sz="4" w:space="0" w:color="00000A"/>
-              <w:right w:val="single" w:sz="4" w:space="0" w:color="00000A"/>
+              <w:top w:val="single" w:color="00000A" w:sz="4" w:space="0"/>
+              <w:left w:val="single" w:color="00000A" w:sz="4" w:space="0"/>
+              <w:bottom w:val="single" w:color="00000A" w:sz="4" w:space="0"/>
+              <w:right w:val="single" w:color="00000A" w:sz="4" w:space="0"/>
             </w:tcBorders>
             <w:shd w:val="clear" w:color="auto" w:fill="C5E0B3" w:themeFill="accent6" w:themeFillTint="66"/>
             <w:tcMar>
@@ -378,10 +386,10 @@
           <w:tcPr>
             <w:tcW w:w="2677" w:type="dxa"/>
             <w:tcBorders>
-              <w:top w:val="single" w:sz="4" w:space="0" w:color="00000A"/>
-              <w:left w:val="single" w:sz="4" w:space="0" w:color="00000A"/>
-              <w:bottom w:val="single" w:sz="4" w:space="0" w:color="00000A"/>
-              <w:right w:val="single" w:sz="4" w:space="0" w:color="00000A"/>
+              <w:top w:val="single" w:color="00000A" w:sz="4" w:space="0"/>
+              <w:left w:val="single" w:color="00000A" w:sz="4" w:space="0"/>
+              <w:bottom w:val="single" w:color="00000A" w:sz="4" w:space="0"/>
+              <w:right w:val="single" w:color="00000A" w:sz="4" w:space="0"/>
             </w:tcBorders>
             <w:shd w:val="clear" w:color="auto" w:fill="C5E0B3" w:themeFill="accent6" w:themeFillTint="66"/>
             <w:tcMar>
@@ -421,10 +429,10 @@
           <w:tcPr>
             <w:tcW w:w="2745" w:type="dxa"/>
             <w:tcBorders>
-              <w:top w:val="single" w:sz="4" w:space="0" w:color="00000A"/>
-              <w:left w:val="single" w:sz="4" w:space="0" w:color="00000A"/>
-              <w:bottom w:val="single" w:sz="4" w:space="0" w:color="00000A"/>
-              <w:right w:val="single" w:sz="4" w:space="0" w:color="00000A"/>
+              <w:top w:val="single" w:color="00000A" w:sz="4" w:space="0"/>
+              <w:left w:val="single" w:color="00000A" w:sz="4" w:space="0"/>
+              <w:bottom w:val="single" w:color="00000A" w:sz="4" w:space="0"/>
+              <w:right w:val="single" w:color="00000A" w:sz="4" w:space="0"/>
             </w:tcBorders>
             <w:shd w:val="clear" w:color="auto" w:fill="C5E0B3" w:themeFill="accent6" w:themeFillTint="66"/>
             <w:tcMar>
@@ -468,10 +476,10 @@
           <w:tcPr>
             <w:tcW w:w="2173" w:type="dxa"/>
             <w:tcBorders>
-              <w:top w:val="single" w:sz="4" w:space="0" w:color="00000A"/>
-              <w:left w:val="single" w:sz="4" w:space="0" w:color="00000A"/>
-              <w:bottom w:val="single" w:sz="4" w:space="0" w:color="00000A"/>
-              <w:right w:val="single" w:sz="4" w:space="0" w:color="00000A"/>
+              <w:top w:val="single" w:color="00000A" w:sz="4" w:space="0"/>
+              <w:left w:val="single" w:color="00000A" w:sz="4" w:space="0"/>
+              <w:bottom w:val="single" w:color="00000A" w:sz="4" w:space="0"/>
+              <w:right w:val="single" w:color="00000A" w:sz="4" w:space="0"/>
             </w:tcBorders>
             <w:shd w:val="clear" w:color="auto" w:fill="D0CECE" w:themeFill="background2" w:themeFillShade="E6"/>
             <w:tcMar>
@@ -509,10 +517,10 @@
           <w:tcPr>
             <w:tcW w:w="2677" w:type="dxa"/>
             <w:tcBorders>
-              <w:top w:val="single" w:sz="4" w:space="0" w:color="00000A"/>
-              <w:left w:val="single" w:sz="4" w:space="0" w:color="00000A"/>
-              <w:bottom w:val="single" w:sz="4" w:space="0" w:color="00000A"/>
-              <w:right w:val="single" w:sz="4" w:space="0" w:color="00000A"/>
+              <w:top w:val="single" w:color="00000A" w:sz="4" w:space="0"/>
+              <w:left w:val="single" w:color="00000A" w:sz="4" w:space="0"/>
+              <w:bottom w:val="single" w:color="00000A" w:sz="4" w:space="0"/>
+              <w:right w:val="single" w:color="00000A" w:sz="4" w:space="0"/>
             </w:tcBorders>
             <w:shd w:val="clear" w:color="auto" w:fill="C5E0B3" w:themeFill="accent6" w:themeFillTint="66"/>
             <w:tcMar>
@@ -552,10 +560,10 @@
           <w:tcPr>
             <w:tcW w:w="2677" w:type="dxa"/>
             <w:tcBorders>
-              <w:top w:val="single" w:sz="4" w:space="0" w:color="00000A"/>
-              <w:left w:val="single" w:sz="4" w:space="0" w:color="00000A"/>
-              <w:bottom w:val="single" w:sz="4" w:space="0" w:color="00000A"/>
-              <w:right w:val="single" w:sz="4" w:space="0" w:color="00000A"/>
+              <w:top w:val="single" w:color="00000A" w:sz="4" w:space="0"/>
+              <w:left w:val="single" w:color="00000A" w:sz="4" w:space="0"/>
+              <w:bottom w:val="single" w:color="00000A" w:sz="4" w:space="0"/>
+              <w:right w:val="single" w:color="00000A" w:sz="4" w:space="0"/>
             </w:tcBorders>
             <w:shd w:val="clear" w:color="auto" w:fill="C5E0B3" w:themeFill="accent6" w:themeFillTint="66"/>
             <w:tcMar>
@@ -595,10 +603,10 @@
           <w:tcPr>
             <w:tcW w:w="2745" w:type="dxa"/>
             <w:tcBorders>
-              <w:top w:val="single" w:sz="4" w:space="0" w:color="00000A"/>
-              <w:left w:val="single" w:sz="4" w:space="0" w:color="00000A"/>
-              <w:bottom w:val="single" w:sz="4" w:space="0" w:color="00000A"/>
-              <w:right w:val="single" w:sz="4" w:space="0" w:color="00000A"/>
+              <w:top w:val="single" w:color="00000A" w:sz="4" w:space="0"/>
+              <w:left w:val="single" w:color="00000A" w:sz="4" w:space="0"/>
+              <w:bottom w:val="single" w:color="00000A" w:sz="4" w:space="0"/>
+              <w:right w:val="single" w:color="00000A" w:sz="4" w:space="0"/>
             </w:tcBorders>
             <w:shd w:val="clear" w:color="auto" w:fill="C5E0B3" w:themeFill="accent6" w:themeFillTint="66"/>
             <w:tcMar>
@@ -614,13 +622,24 @@
               <w:pStyle w:val="Standard"/>
               <w:rPr>
                 <w:rFonts w:ascii="Arial" w:hAnsi="Arial"/>
-                <w:i/>
-                <w:iCs/>
+                <w:i w:val="1"/>
+                <w:iCs w:val="1"/>
                 <w:color w:val="000000" w:themeColor="text1"/>
                 <w:sz w:val="20"/>
                 <w:szCs w:val="20"/>
               </w:rPr>
             </w:pPr>
+            <w:r>
+              <w:rPr>
+                <w:rFonts w:ascii="Arial" w:hAnsi="Arial"/>
+                <w:i w:val="1"/>
+                <w:iCs w:val="1"/>
+                <w:color w:val="000000" w:themeColor="text1" w:themeTint="FF" w:themeShade="FF"/>
+                <w:sz w:val="20"/>
+                <w:szCs w:val="20"/>
+              </w:rPr>
+              <w:t>23119169</w:t>
+            </w:r>
           </w:p>
         </w:tc>
       </w:tr>
@@ -633,10 +652,10 @@
           <w:tcPr>
             <w:tcW w:w="2173" w:type="dxa"/>
             <w:tcBorders>
-              <w:top w:val="single" w:sz="4" w:space="0" w:color="00000A"/>
-              <w:left w:val="single" w:sz="4" w:space="0" w:color="00000A"/>
-              <w:bottom w:val="single" w:sz="4" w:space="0" w:color="00000A"/>
-              <w:right w:val="single" w:sz="4" w:space="0" w:color="00000A"/>
+              <w:top w:val="single" w:color="00000A" w:sz="4" w:space="0"/>
+              <w:left w:val="single" w:color="00000A" w:sz="4" w:space="0"/>
+              <w:bottom w:val="single" w:color="00000A" w:sz="4" w:space="0"/>
+              <w:right w:val="single" w:color="00000A" w:sz="4" w:space="0"/>
             </w:tcBorders>
             <w:shd w:val="clear" w:color="auto" w:fill="D0CECE" w:themeFill="background2" w:themeFillShade="E6"/>
             <w:tcMar>
@@ -673,10 +692,10 @@
             <w:tcW w:w="8099" w:type="dxa"/>
             <w:gridSpan w:val="3"/>
             <w:tcBorders>
-              <w:top w:val="single" w:sz="4" w:space="0" w:color="00000A"/>
-              <w:left w:val="single" w:sz="4" w:space="0" w:color="00000A"/>
-              <w:bottom w:val="single" w:sz="4" w:space="0" w:color="00000A"/>
-              <w:right w:val="single" w:sz="4" w:space="0" w:color="00000A"/>
+              <w:top w:val="single" w:color="00000A" w:sz="4" w:space="0"/>
+              <w:left w:val="single" w:color="00000A" w:sz="4" w:space="0"/>
+              <w:bottom w:val="single" w:color="00000A" w:sz="4" w:space="0"/>
+              <w:right w:val="single" w:color="00000A" w:sz="4" w:space="0"/>
             </w:tcBorders>
             <w:shd w:val="clear" w:color="auto" w:fill="FFFFFF" w:themeFill="background1"/>
             <w:tcMar>
@@ -745,10 +764,10 @@
           <w:tcPr>
             <w:tcW w:w="2173" w:type="dxa"/>
             <w:tcBorders>
-              <w:top w:val="single" w:sz="4" w:space="0" w:color="00000A"/>
-              <w:left w:val="single" w:sz="4" w:space="0" w:color="00000A"/>
-              <w:bottom w:val="single" w:sz="4" w:space="0" w:color="00000A"/>
-              <w:right w:val="single" w:sz="4" w:space="0" w:color="00000A"/>
+              <w:top w:val="single" w:color="00000A" w:sz="4" w:space="0"/>
+              <w:left w:val="single" w:color="00000A" w:sz="4" w:space="0"/>
+              <w:bottom w:val="single" w:color="00000A" w:sz="4" w:space="0"/>
+              <w:right w:val="single" w:color="00000A" w:sz="4" w:space="0"/>
             </w:tcBorders>
             <w:shd w:val="clear" w:color="auto" w:fill="D0CECE" w:themeFill="background2" w:themeFillShade="E6"/>
             <w:tcMar>
@@ -785,10 +804,10 @@
             <w:tcW w:w="8099" w:type="dxa"/>
             <w:gridSpan w:val="3"/>
             <w:tcBorders>
-              <w:top w:val="single" w:sz="4" w:space="0" w:color="00000A"/>
-              <w:left w:val="single" w:sz="4" w:space="0" w:color="00000A"/>
-              <w:bottom w:val="single" w:sz="4" w:space="0" w:color="00000A"/>
-              <w:right w:val="single" w:sz="4" w:space="0" w:color="00000A"/>
+              <w:top w:val="single" w:color="00000A" w:sz="4" w:space="0"/>
+              <w:left w:val="single" w:color="00000A" w:sz="4" w:space="0"/>
+              <w:bottom w:val="single" w:color="00000A" w:sz="4" w:space="0"/>
+              <w:right w:val="single" w:color="00000A" w:sz="4" w:space="0"/>
             </w:tcBorders>
             <w:shd w:val="clear" w:color="auto" w:fill="FFFFFF" w:themeFill="background1"/>
             <w:tcMar>
@@ -839,10 +858,10 @@
           <w:tcPr>
             <w:tcW w:w="2173" w:type="dxa"/>
             <w:tcBorders>
-              <w:top w:val="single" w:sz="4" w:space="0" w:color="00000A"/>
-              <w:left w:val="single" w:sz="4" w:space="0" w:color="00000A"/>
-              <w:bottom w:val="single" w:sz="4" w:space="0" w:color="00000A"/>
-              <w:right w:val="single" w:sz="4" w:space="0" w:color="00000A"/>
+              <w:top w:val="single" w:color="00000A" w:sz="4" w:space="0"/>
+              <w:left w:val="single" w:color="00000A" w:sz="4" w:space="0"/>
+              <w:bottom w:val="single" w:color="00000A" w:sz="4" w:space="0"/>
+              <w:right w:val="single" w:color="00000A" w:sz="4" w:space="0"/>
             </w:tcBorders>
             <w:shd w:val="clear" w:color="auto" w:fill="D0CECE" w:themeFill="background2" w:themeFillShade="E6"/>
             <w:tcMar>
@@ -879,10 +898,10 @@
             <w:tcW w:w="8099" w:type="dxa"/>
             <w:gridSpan w:val="3"/>
             <w:tcBorders>
-              <w:top w:val="single" w:sz="4" w:space="0" w:color="00000A"/>
-              <w:left w:val="single" w:sz="4" w:space="0" w:color="00000A"/>
-              <w:bottom w:val="single" w:sz="4" w:space="0" w:color="00000A"/>
-              <w:right w:val="single" w:sz="4" w:space="0" w:color="00000A"/>
+              <w:top w:val="single" w:color="00000A" w:sz="4" w:space="0"/>
+              <w:left w:val="single" w:color="00000A" w:sz="4" w:space="0"/>
+              <w:bottom w:val="single" w:color="00000A" w:sz="4" w:space="0"/>
+              <w:right w:val="single" w:color="00000A" w:sz="4" w:space="0"/>
             </w:tcBorders>
             <w:shd w:val="clear" w:color="auto" w:fill="FFFFFF" w:themeFill="background1"/>
             <w:tcMar>
@@ -924,10 +943,10 @@
           <w:tcPr>
             <w:tcW w:w="2173" w:type="dxa"/>
             <w:tcBorders>
-              <w:top w:val="single" w:sz="4" w:space="0" w:color="00000A"/>
-              <w:left w:val="single" w:sz="4" w:space="0" w:color="00000A"/>
-              <w:bottom w:val="single" w:sz="2" w:space="0" w:color="00000A"/>
-              <w:right w:val="single" w:sz="4" w:space="0" w:color="00000A"/>
+              <w:top w:val="single" w:color="00000A" w:sz="4" w:space="0"/>
+              <w:left w:val="single" w:color="00000A" w:sz="4" w:space="0"/>
+              <w:bottom w:val="single" w:color="00000A" w:sz="2" w:space="0"/>
+              <w:right w:val="single" w:color="00000A" w:sz="4" w:space="0"/>
             </w:tcBorders>
             <w:shd w:val="clear" w:color="auto" w:fill="D0CECE" w:themeFill="background2" w:themeFillShade="E6"/>
             <w:tcMar>
@@ -964,10 +983,10 @@
             <w:tcW w:w="8099" w:type="dxa"/>
             <w:gridSpan w:val="3"/>
             <w:tcBorders>
-              <w:top w:val="single" w:sz="4" w:space="0" w:color="00000A"/>
-              <w:left w:val="single" w:sz="4" w:space="0" w:color="00000A"/>
-              <w:bottom w:val="single" w:sz="2" w:space="0" w:color="00000A"/>
-              <w:right w:val="single" w:sz="4" w:space="0" w:color="00000A"/>
+              <w:top w:val="single" w:color="00000A" w:sz="4" w:space="0"/>
+              <w:left w:val="single" w:color="00000A" w:sz="4" w:space="0"/>
+              <w:bottom w:val="single" w:color="00000A" w:sz="2" w:space="0"/>
+              <w:right w:val="single" w:color="00000A" w:sz="4" w:space="0"/>
             </w:tcBorders>
             <w:shd w:val="clear" w:color="auto" w:fill="FFFFFF" w:themeFill="background1"/>
             <w:tcMar>
@@ -1018,10 +1037,10 @@
           <w:tcPr>
             <w:tcW w:w="2173" w:type="dxa"/>
             <w:tcBorders>
-              <w:top w:val="single" w:sz="4" w:space="0" w:color="00000A"/>
-              <w:left w:val="single" w:sz="4" w:space="0" w:color="00000A"/>
-              <w:bottom w:val="single" w:sz="2" w:space="0" w:color="00000A"/>
-              <w:right w:val="single" w:sz="4" w:space="0" w:color="00000A"/>
+              <w:top w:val="single" w:color="00000A" w:sz="4" w:space="0"/>
+              <w:left w:val="single" w:color="00000A" w:sz="4" w:space="0"/>
+              <w:bottom w:val="single" w:color="00000A" w:sz="2" w:space="0"/>
+              <w:right w:val="single" w:color="00000A" w:sz="4" w:space="0"/>
             </w:tcBorders>
             <w:shd w:val="clear" w:color="auto" w:fill="D0CECE" w:themeFill="background2" w:themeFillShade="E6"/>
             <w:tcMar>
@@ -1058,10 +1077,10 @@
             <w:tcW w:w="8099" w:type="dxa"/>
             <w:gridSpan w:val="3"/>
             <w:tcBorders>
-              <w:top w:val="single" w:sz="4" w:space="0" w:color="00000A"/>
-              <w:left w:val="single" w:sz="4" w:space="0" w:color="00000A"/>
-              <w:bottom w:val="single" w:sz="2" w:space="0" w:color="00000A"/>
-              <w:right w:val="single" w:sz="4" w:space="0" w:color="00000A"/>
+              <w:top w:val="single" w:color="00000A" w:sz="4" w:space="0"/>
+              <w:left w:val="single" w:color="00000A" w:sz="4" w:space="0"/>
+              <w:bottom w:val="single" w:color="00000A" w:sz="2" w:space="0"/>
+              <w:right w:val="single" w:color="00000A" w:sz="4" w:space="0"/>
             </w:tcBorders>
             <w:shd w:val="clear" w:color="auto" w:fill="FFFFFF" w:themeFill="background1"/>
             <w:tcMar>
@@ -1413,7 +1432,7 @@
             </w:pPr>
             <w:r>
               <w:rPr>
-                <w:rFonts w:ascii="Arial" w:eastAsia="Arial" w:hAnsi="Arial" w:cs="Arial"/>
+                <w:rFonts w:ascii="Arial" w:hAnsi="Arial" w:eastAsia="Arial" w:cs="Arial"/>
                 <w:b/>
                 <w:bCs/>
                 <w:color w:val="000000" w:themeColor="text1"/>
@@ -1528,7 +1547,7 @@
             </w:pPr>
             <w:r>
               <w:rPr>
-                <w:rFonts w:ascii="MS Gothic" w:eastAsia="MS Gothic" w:hAnsi="MS Gothic" w:cstheme="minorBidi"/>
+                <w:rFonts w:ascii="MS Gothic" w:hAnsi="MS Gothic" w:eastAsia="MS Gothic" w:cstheme="minorBidi"/>
                 <w:b/>
                 <w:bCs/>
                 <w:sz w:val="22"/>
@@ -1666,16 +1685,16 @@
             <w:pPr>
               <w:jc w:val="center"/>
               <w:rPr>
-                <w:rFonts w:ascii="MS Gothic" w:eastAsia="MS Gothic" w:hAnsi="MS Gothic" w:cstheme="minorBidi"/>
-                <w:b/>
-                <w:bCs/>
-                <w:sz w:val="22"/>
-                <w:szCs w:val="22"/>
-              </w:rPr>
-            </w:pPr>
-            <w:r>
-              <w:rPr>
-                <w:rFonts w:ascii="MS Gothic" w:eastAsia="MS Gothic" w:hAnsi="MS Gothic" w:cstheme="minorBidi"/>
+                <w:rFonts w:ascii="MS Gothic" w:hAnsi="MS Gothic" w:eastAsia="MS Gothic" w:cstheme="minorBidi"/>
+                <w:b/>
+                <w:bCs/>
+                <w:sz w:val="22"/>
+                <w:szCs w:val="22"/>
+              </w:rPr>
+            </w:pPr>
+            <w:r>
+              <w:rPr>
+                <w:rFonts w:ascii="MS Gothic" w:hAnsi="MS Gothic" w:eastAsia="MS Gothic" w:cstheme="minorBidi"/>
                 <w:b/>
                 <w:bCs/>
                 <w:sz w:val="22"/>
@@ -1685,7 +1704,7 @@
             </w:r>
             <w:r>
               <w:rPr>
-                <w:rFonts w:ascii="MS Gothic" w:eastAsia="MS Gothic" w:hAnsi="MS Gothic" w:cstheme="minorBidi"/>
+                <w:rFonts w:ascii="MS Gothic" w:hAnsi="MS Gothic" w:eastAsia="MS Gothic" w:cstheme="minorBidi"/>
                 <w:b/>
                 <w:bCs/>
                 <w:sz w:val="22"/>
@@ -1832,16 +1851,16 @@
             <w:pPr>
               <w:jc w:val="center"/>
               <w:rPr>
-                <w:rFonts w:ascii="MS Gothic" w:eastAsia="MS Gothic" w:hAnsi="MS Gothic" w:cstheme="minorBidi"/>
-                <w:b/>
-                <w:bCs/>
-                <w:sz w:val="22"/>
-                <w:szCs w:val="22"/>
-              </w:rPr>
-            </w:pPr>
-            <w:r>
-              <w:rPr>
-                <w:rFonts w:ascii="MS Gothic" w:eastAsia="MS Gothic" w:hAnsi="MS Gothic" w:cstheme="minorBidi"/>
+                <w:rFonts w:ascii="MS Gothic" w:hAnsi="MS Gothic" w:eastAsia="MS Gothic" w:cstheme="minorBidi"/>
+                <w:b/>
+                <w:bCs/>
+                <w:sz w:val="22"/>
+                <w:szCs w:val="22"/>
+              </w:rPr>
+            </w:pPr>
+            <w:r>
+              <w:rPr>
+                <w:rFonts w:ascii="MS Gothic" w:hAnsi="MS Gothic" w:eastAsia="MS Gothic" w:cstheme="minorBidi"/>
                 <w:b/>
                 <w:bCs/>
                 <w:sz w:val="22"/>
@@ -1851,7 +1870,7 @@
             </w:r>
             <w:r>
               <w:rPr>
-                <w:rFonts w:ascii="MS Gothic" w:eastAsia="MS Gothic" w:hAnsi="MS Gothic" w:cstheme="minorBidi"/>
+                <w:rFonts w:ascii="MS Gothic" w:hAnsi="MS Gothic" w:eastAsia="MS Gothic" w:cstheme="minorBidi"/>
                 <w:b/>
                 <w:bCs/>
                 <w:sz w:val="22"/>
@@ -1938,16 +1957,16 @@
             <w:pPr>
               <w:jc w:val="center"/>
               <w:rPr>
-                <w:rFonts w:ascii="MS Gothic" w:eastAsia="MS Gothic" w:hAnsi="MS Gothic" w:cstheme="minorBidi"/>
-                <w:b/>
-                <w:bCs/>
-                <w:sz w:val="22"/>
-                <w:szCs w:val="22"/>
-              </w:rPr>
-            </w:pPr>
-            <w:r>
-              <w:rPr>
-                <w:rFonts w:ascii="MS Gothic" w:eastAsia="MS Gothic" w:hAnsi="MS Gothic" w:cstheme="minorBidi"/>
+                <w:rFonts w:ascii="MS Gothic" w:hAnsi="MS Gothic" w:eastAsia="MS Gothic" w:cstheme="minorBidi"/>
+                <w:b/>
+                <w:bCs/>
+                <w:sz w:val="22"/>
+                <w:szCs w:val="22"/>
+              </w:rPr>
+            </w:pPr>
+            <w:r>
+              <w:rPr>
+                <w:rFonts w:ascii="MS Gothic" w:hAnsi="MS Gothic" w:eastAsia="MS Gothic" w:cstheme="minorBidi"/>
                 <w:b/>
                 <w:bCs/>
                 <w:sz w:val="22"/>
@@ -1957,7 +1976,7 @@
             </w:r>
             <w:r>
               <w:rPr>
-                <w:rFonts w:ascii="MS Gothic" w:eastAsia="MS Gothic" w:hAnsi="MS Gothic" w:cstheme="minorBidi"/>
+                <w:rFonts w:ascii="MS Gothic" w:hAnsi="MS Gothic" w:eastAsia="MS Gothic" w:cstheme="minorBidi"/>
                 <w:b/>
                 <w:bCs/>
                 <w:sz w:val="22"/>
@@ -2071,16 +2090,16 @@
             <w:pPr>
               <w:jc w:val="center"/>
               <w:rPr>
-                <w:rFonts w:ascii="MS Gothic" w:eastAsia="MS Gothic" w:hAnsi="MS Gothic" w:cstheme="minorBidi"/>
-                <w:b/>
-                <w:bCs/>
-                <w:sz w:val="22"/>
-                <w:szCs w:val="22"/>
-              </w:rPr>
-            </w:pPr>
-            <w:r>
-              <w:rPr>
-                <w:rFonts w:ascii="MS Gothic" w:eastAsia="MS Gothic" w:hAnsi="MS Gothic" w:cstheme="minorBidi"/>
+                <w:rFonts w:ascii="MS Gothic" w:hAnsi="MS Gothic" w:eastAsia="MS Gothic" w:cstheme="minorBidi"/>
+                <w:b/>
+                <w:bCs/>
+                <w:sz w:val="22"/>
+                <w:szCs w:val="22"/>
+              </w:rPr>
+            </w:pPr>
+            <w:r>
+              <w:rPr>
+                <w:rFonts w:ascii="MS Gothic" w:hAnsi="MS Gothic" w:eastAsia="MS Gothic" w:cstheme="minorBidi"/>
                 <w:b/>
                 <w:bCs/>
                 <w:sz w:val="22"/>
@@ -2090,7 +2109,7 @@
             </w:r>
             <w:r>
               <w:rPr>
-                <w:rFonts w:ascii="MS Gothic" w:eastAsia="MS Gothic" w:hAnsi="MS Gothic" w:cstheme="minorBidi"/>
+                <w:rFonts w:ascii="MS Gothic" w:hAnsi="MS Gothic" w:eastAsia="MS Gothic" w:cstheme="minorBidi"/>
                 <w:b/>
                 <w:bCs/>
                 <w:sz w:val="22"/>
@@ -2167,16 +2186,16 @@
             <w:pPr>
               <w:jc w:val="center"/>
               <w:rPr>
-                <w:rFonts w:ascii="MS Gothic" w:eastAsia="MS Gothic" w:hAnsi="MS Gothic" w:cstheme="minorBidi"/>
-                <w:b/>
-                <w:bCs/>
-                <w:sz w:val="22"/>
-                <w:szCs w:val="22"/>
-              </w:rPr>
-            </w:pPr>
-            <w:r>
-              <w:rPr>
-                <w:rFonts w:ascii="MS Gothic" w:eastAsia="MS Gothic" w:hAnsi="MS Gothic" w:cstheme="minorBidi"/>
+                <w:rFonts w:ascii="MS Gothic" w:hAnsi="MS Gothic" w:eastAsia="MS Gothic" w:cstheme="minorBidi"/>
+                <w:b/>
+                <w:bCs/>
+                <w:sz w:val="22"/>
+                <w:szCs w:val="22"/>
+              </w:rPr>
+            </w:pPr>
+            <w:r>
+              <w:rPr>
+                <w:rFonts w:ascii="MS Gothic" w:hAnsi="MS Gothic" w:eastAsia="MS Gothic" w:cstheme="minorBidi"/>
                 <w:b/>
                 <w:bCs/>
                 <w:sz w:val="22"/>
@@ -2231,16 +2250,16 @@
             <w:pPr>
               <w:jc w:val="center"/>
               <w:rPr>
-                <w:rFonts w:ascii="MS Gothic" w:eastAsia="MS Gothic" w:hAnsi="MS Gothic" w:cstheme="minorBidi"/>
-                <w:b/>
-                <w:bCs/>
-                <w:sz w:val="22"/>
-                <w:szCs w:val="22"/>
-              </w:rPr>
-            </w:pPr>
-            <w:r>
-              <w:rPr>
-                <w:rFonts w:ascii="MS Gothic" w:eastAsia="MS Gothic" w:hAnsi="MS Gothic" w:cstheme="minorBidi"/>
+                <w:rFonts w:ascii="MS Gothic" w:hAnsi="MS Gothic" w:eastAsia="MS Gothic" w:cstheme="minorBidi"/>
+                <w:b/>
+                <w:bCs/>
+                <w:sz w:val="22"/>
+                <w:szCs w:val="22"/>
+              </w:rPr>
+            </w:pPr>
+            <w:r>
+              <w:rPr>
+                <w:rFonts w:ascii="MS Gothic" w:hAnsi="MS Gothic" w:eastAsia="MS Gothic" w:cstheme="minorBidi"/>
                 <w:b/>
                 <w:bCs/>
                 <w:sz w:val="22"/>
@@ -2434,16 +2453,16 @@
             <w:pPr>
               <w:jc w:val="center"/>
               <w:rPr>
-                <w:rFonts w:ascii="MS Gothic" w:eastAsia="MS Gothic" w:hAnsi="MS Gothic" w:cstheme="minorBidi"/>
-                <w:b/>
-                <w:bCs/>
-                <w:sz w:val="22"/>
-                <w:szCs w:val="22"/>
-              </w:rPr>
-            </w:pPr>
-            <w:r>
-              <w:rPr>
-                <w:rFonts w:ascii="MS Gothic" w:eastAsia="MS Gothic" w:hAnsi="MS Gothic" w:cstheme="minorBidi"/>
+                <w:rFonts w:ascii="MS Gothic" w:hAnsi="MS Gothic" w:eastAsia="MS Gothic" w:cstheme="minorBidi"/>
+                <w:b/>
+                <w:bCs/>
+                <w:sz w:val="22"/>
+                <w:szCs w:val="22"/>
+              </w:rPr>
+            </w:pPr>
+            <w:r>
+              <w:rPr>
+                <w:rFonts w:ascii="MS Gothic" w:hAnsi="MS Gothic" w:eastAsia="MS Gothic" w:cstheme="minorBidi"/>
                 <w:b/>
                 <w:bCs/>
                 <w:sz w:val="22"/>
@@ -2453,7 +2472,7 @@
             </w:r>
             <w:r>
               <w:rPr>
-                <w:rFonts w:ascii="MS Gothic" w:eastAsia="MS Gothic" w:hAnsi="MS Gothic" w:cstheme="minorBidi"/>
+                <w:rFonts w:ascii="MS Gothic" w:hAnsi="MS Gothic" w:eastAsia="MS Gothic" w:cstheme="minorBidi"/>
                 <w:b/>
                 <w:bCs/>
                 <w:sz w:val="22"/>
@@ -2482,7 +2501,7 @@
             </w:pPr>
             <w:r>
               <w:rPr>
-                <w:rFonts w:ascii="Arial" w:eastAsia="Arial" w:hAnsi="Arial" w:cs="Arial"/>
+                <w:rFonts w:ascii="Arial" w:hAnsi="Arial" w:eastAsia="Arial" w:cs="Arial"/>
                 <w:b/>
                 <w:bCs/>
                 <w:color w:val="000000" w:themeColor="text1"/>
@@ -2602,14 +2621,14 @@
             <w:pPr>
               <w:jc w:val="center"/>
               <w:rPr>
-                <w:rFonts w:ascii="MS Gothic" w:eastAsia="MS Gothic" w:hAnsi="MS Gothic" w:cs="MS Gothic"/>
-                <w:sz w:val="22"/>
-                <w:szCs w:val="22"/>
-              </w:rPr>
-            </w:pPr>
-            <w:r>
-              <w:rPr>
-                <w:rFonts w:ascii="MS Gothic" w:eastAsia="MS Gothic" w:hAnsi="MS Gothic" w:cs="MS Gothic"/>
+                <w:rFonts w:ascii="MS Gothic" w:hAnsi="MS Gothic" w:eastAsia="MS Gothic" w:cs="MS Gothic"/>
+                <w:sz w:val="22"/>
+                <w:szCs w:val="22"/>
+              </w:rPr>
+            </w:pPr>
+            <w:r>
+              <w:rPr>
+                <w:rFonts w:ascii="MS Gothic" w:hAnsi="MS Gothic" w:eastAsia="MS Gothic" w:cs="MS Gothic"/>
                 <w:b/>
                 <w:bCs/>
                 <w:color w:val="000000" w:themeColor="text1"/>
@@ -2623,7 +2642,7 @@
             <w:pPr>
               <w:jc w:val="center"/>
               <w:rPr>
-                <w:rFonts w:ascii="MS Gothic" w:eastAsia="MS Gothic" w:hAnsi="MS Gothic" w:cstheme="minorBidi"/>
+                <w:rFonts w:ascii="MS Gothic" w:hAnsi="MS Gothic" w:eastAsia="MS Gothic" w:cstheme="minorBidi"/>
                 <w:b/>
                 <w:bCs/>
                 <w:sz w:val="22"/>
@@ -2726,14 +2745,14 @@
             <w:pPr>
               <w:jc w:val="center"/>
               <w:rPr>
-                <w:rFonts w:ascii="MS Gothic" w:eastAsia="MS Gothic" w:hAnsi="MS Gothic" w:cs="MS Gothic"/>
-                <w:sz w:val="22"/>
-                <w:szCs w:val="22"/>
-              </w:rPr>
-            </w:pPr>
-            <w:r>
-              <w:rPr>
-                <w:rFonts w:ascii="MS Gothic" w:eastAsia="MS Gothic" w:hAnsi="MS Gothic" w:cs="MS Gothic"/>
+                <w:rFonts w:ascii="MS Gothic" w:hAnsi="MS Gothic" w:eastAsia="MS Gothic" w:cs="MS Gothic"/>
+                <w:sz w:val="22"/>
+                <w:szCs w:val="22"/>
+              </w:rPr>
+            </w:pPr>
+            <w:r>
+              <w:rPr>
+                <w:rFonts w:ascii="MS Gothic" w:hAnsi="MS Gothic" w:eastAsia="MS Gothic" w:cs="MS Gothic"/>
                 <w:b/>
                 <w:bCs/>
                 <w:color w:val="000000" w:themeColor="text1"/>
@@ -2747,7 +2766,7 @@
             <w:pPr>
               <w:jc w:val="center"/>
               <w:rPr>
-                <w:rFonts w:ascii="MS Gothic" w:eastAsia="MS Gothic" w:hAnsi="MS Gothic" w:cstheme="minorBidi"/>
+                <w:rFonts w:ascii="MS Gothic" w:hAnsi="MS Gothic" w:eastAsia="MS Gothic" w:cstheme="minorBidi"/>
                 <w:b/>
                 <w:bCs/>
                 <w:sz w:val="22"/>
@@ -2759,7 +2778,7 @@
             <w:pPr>
               <w:jc w:val="center"/>
               <w:rPr>
-                <w:rFonts w:ascii="MS Gothic" w:eastAsia="MS Gothic" w:hAnsi="MS Gothic" w:cstheme="minorBidi"/>
+                <w:rFonts w:ascii="MS Gothic" w:hAnsi="MS Gothic" w:eastAsia="MS Gothic" w:cstheme="minorBidi"/>
                 <w:b/>
                 <w:bCs/>
                 <w:sz w:val="22"/>
@@ -2864,14 +2883,14 @@
             <w:pPr>
               <w:jc w:val="center"/>
               <w:rPr>
-                <w:rFonts w:ascii="MS Gothic" w:eastAsia="MS Gothic" w:hAnsi="MS Gothic" w:cs="MS Gothic"/>
-                <w:sz w:val="22"/>
-                <w:szCs w:val="22"/>
-              </w:rPr>
-            </w:pPr>
-            <w:r>
-              <w:rPr>
-                <w:rFonts w:ascii="MS Gothic" w:eastAsia="MS Gothic" w:hAnsi="MS Gothic" w:cs="MS Gothic"/>
+                <w:rFonts w:ascii="MS Gothic" w:hAnsi="MS Gothic" w:eastAsia="MS Gothic" w:cs="MS Gothic"/>
+                <w:sz w:val="22"/>
+                <w:szCs w:val="22"/>
+              </w:rPr>
+            </w:pPr>
+            <w:r>
+              <w:rPr>
+                <w:rFonts w:ascii="MS Gothic" w:hAnsi="MS Gothic" w:eastAsia="MS Gothic" w:cs="MS Gothic"/>
                 <w:b/>
                 <w:bCs/>
                 <w:color w:val="000000" w:themeColor="text1"/>
@@ -2885,7 +2904,7 @@
             <w:pPr>
               <w:jc w:val="center"/>
               <w:rPr>
-                <w:rFonts w:ascii="MS Gothic" w:eastAsia="MS Gothic" w:hAnsi="MS Gothic" w:cstheme="minorBidi"/>
+                <w:rFonts w:ascii="MS Gothic" w:hAnsi="MS Gothic" w:eastAsia="MS Gothic" w:cstheme="minorBidi"/>
                 <w:b/>
                 <w:bCs/>
                 <w:sz w:val="22"/>
@@ -2897,7 +2916,7 @@
             <w:pPr>
               <w:jc w:val="center"/>
               <w:rPr>
-                <w:rFonts w:ascii="MS Gothic" w:eastAsia="MS Gothic" w:hAnsi="MS Gothic" w:cstheme="minorBidi"/>
+                <w:rFonts w:ascii="MS Gothic" w:hAnsi="MS Gothic" w:eastAsia="MS Gothic" w:cstheme="minorBidi"/>
                 <w:b/>
                 <w:bCs/>
                 <w:sz w:val="22"/>
@@ -2925,7 +2944,7 @@
             </w:pPr>
             <w:r>
               <w:rPr>
-                <w:rFonts w:ascii="Arial" w:eastAsia="Arial" w:hAnsi="Arial" w:cs="Arial"/>
+                <w:rFonts w:ascii="Arial" w:hAnsi="Arial" w:eastAsia="Arial" w:cs="Arial"/>
                 <w:b/>
                 <w:bCs/>
                 <w:color w:val="000000" w:themeColor="text1"/>
@@ -2936,7 +2955,7 @@
             </w:r>
             <w:r>
               <w:rPr>
-                <w:rFonts w:ascii="Arial" w:eastAsia="Arial" w:hAnsi="Arial" w:cs="Arial"/>
+                <w:rFonts w:ascii="Arial" w:hAnsi="Arial" w:eastAsia="Arial" w:cs="Arial"/>
                 <w:b/>
                 <w:bCs/>
                 <w:color w:val="000000" w:themeColor="text1"/>
@@ -2947,7 +2966,7 @@
             </w:r>
             <w:r>
               <w:rPr>
-                <w:rFonts w:ascii="Arial" w:eastAsia="Arial" w:hAnsi="Arial" w:cs="Arial"/>
+                <w:rFonts w:ascii="Arial" w:hAnsi="Arial" w:eastAsia="Arial" w:cs="Arial"/>
                 <w:b/>
                 <w:bCs/>
                 <w:color w:val="000000" w:themeColor="text1"/>
@@ -3125,16 +3144,16 @@
             <w:pPr>
               <w:jc w:val="center"/>
               <w:rPr>
-                <w:rFonts w:ascii="MS Gothic" w:eastAsia="MS Gothic" w:hAnsi="MS Gothic" w:cstheme="minorBidi"/>
-                <w:b/>
-                <w:bCs/>
-                <w:sz w:val="22"/>
-                <w:szCs w:val="22"/>
-              </w:rPr>
-            </w:pPr>
-            <w:r>
-              <w:rPr>
-                <w:rFonts w:ascii="MS Gothic" w:eastAsia="MS Gothic" w:hAnsi="MS Gothic" w:cstheme="minorBidi"/>
+                <w:rFonts w:ascii="MS Gothic" w:hAnsi="MS Gothic" w:eastAsia="MS Gothic" w:cstheme="minorBidi"/>
+                <w:b/>
+                <w:bCs/>
+                <w:sz w:val="22"/>
+                <w:szCs w:val="22"/>
+              </w:rPr>
+            </w:pPr>
+            <w:r>
+              <w:rPr>
+                <w:rFonts w:ascii="MS Gothic" w:hAnsi="MS Gothic" w:eastAsia="MS Gothic" w:cstheme="minorBidi"/>
                 <w:b/>
                 <w:bCs/>
                 <w:sz w:val="22"/>
@@ -3245,16 +3264,16 @@
             <w:pPr>
               <w:jc w:val="center"/>
               <w:rPr>
-                <w:rFonts w:ascii="MS Gothic" w:eastAsia="MS Gothic" w:hAnsi="MS Gothic" w:cstheme="minorBidi"/>
-                <w:b/>
-                <w:bCs/>
-                <w:sz w:val="22"/>
-                <w:szCs w:val="22"/>
-              </w:rPr>
-            </w:pPr>
-            <w:r>
-              <w:rPr>
-                <w:rFonts w:ascii="MS Gothic" w:eastAsia="MS Gothic" w:hAnsi="MS Gothic" w:cstheme="minorBidi"/>
+                <w:rFonts w:ascii="MS Gothic" w:hAnsi="MS Gothic" w:eastAsia="MS Gothic" w:cstheme="minorBidi"/>
+                <w:b/>
+                <w:bCs/>
+                <w:sz w:val="22"/>
+                <w:szCs w:val="22"/>
+              </w:rPr>
+            </w:pPr>
+            <w:r>
+              <w:rPr>
+                <w:rFonts w:ascii="MS Gothic" w:hAnsi="MS Gothic" w:eastAsia="MS Gothic" w:cstheme="minorBidi"/>
                 <w:b/>
                 <w:bCs/>
                 <w:sz w:val="22"/>
@@ -3355,16 +3374,16 @@
             <w:pPr>
               <w:jc w:val="center"/>
               <w:rPr>
-                <w:rFonts w:ascii="MS Gothic" w:eastAsia="MS Gothic" w:hAnsi="MS Gothic" w:cstheme="minorBidi"/>
-                <w:b/>
-                <w:bCs/>
-                <w:sz w:val="22"/>
-                <w:szCs w:val="22"/>
-              </w:rPr>
-            </w:pPr>
-            <w:r>
-              <w:rPr>
-                <w:rFonts w:ascii="MS Gothic" w:eastAsia="MS Gothic" w:hAnsi="MS Gothic" w:cstheme="minorBidi"/>
+                <w:rFonts w:ascii="MS Gothic" w:hAnsi="MS Gothic" w:eastAsia="MS Gothic" w:cstheme="minorBidi"/>
+                <w:b/>
+                <w:bCs/>
+                <w:sz w:val="22"/>
+                <w:szCs w:val="22"/>
+              </w:rPr>
+            </w:pPr>
+            <w:r>
+              <w:rPr>
+                <w:rFonts w:ascii="MS Gothic" w:hAnsi="MS Gothic" w:eastAsia="MS Gothic" w:cstheme="minorBidi"/>
                 <w:b/>
                 <w:bCs/>
                 <w:sz w:val="22"/>
@@ -3465,16 +3484,16 @@
             <w:pPr>
               <w:jc w:val="center"/>
               <w:rPr>
-                <w:rFonts w:ascii="MS Gothic" w:eastAsia="MS Gothic" w:hAnsi="MS Gothic" w:cstheme="minorBidi"/>
-                <w:b/>
-                <w:bCs/>
-                <w:sz w:val="22"/>
-                <w:szCs w:val="22"/>
-              </w:rPr>
-            </w:pPr>
-            <w:r>
-              <w:rPr>
-                <w:rFonts w:ascii="MS Gothic" w:eastAsia="MS Gothic" w:hAnsi="MS Gothic" w:cstheme="minorBidi"/>
+                <w:rFonts w:ascii="MS Gothic" w:hAnsi="MS Gothic" w:eastAsia="MS Gothic" w:cstheme="minorBidi"/>
+                <w:b/>
+                <w:bCs/>
+                <w:sz w:val="22"/>
+                <w:szCs w:val="22"/>
+              </w:rPr>
+            </w:pPr>
+            <w:r>
+              <w:rPr>
+                <w:rFonts w:ascii="MS Gothic" w:hAnsi="MS Gothic" w:eastAsia="MS Gothic" w:cstheme="minorBidi"/>
                 <w:b/>
                 <w:bCs/>
                 <w:sz w:val="22"/>
@@ -3619,16 +3638,16 @@
             <w:pPr>
               <w:jc w:val="center"/>
               <w:rPr>
-                <w:rFonts w:ascii="MS Gothic" w:eastAsia="MS Gothic" w:hAnsi="MS Gothic" w:cstheme="minorBidi"/>
-                <w:b/>
-                <w:bCs/>
-                <w:sz w:val="22"/>
-                <w:szCs w:val="22"/>
-              </w:rPr>
-            </w:pPr>
-            <w:r>
-              <w:rPr>
-                <w:rFonts w:ascii="MS Gothic" w:eastAsia="MS Gothic" w:hAnsi="MS Gothic" w:cstheme="minorBidi"/>
+                <w:rFonts w:ascii="MS Gothic" w:hAnsi="MS Gothic" w:eastAsia="MS Gothic" w:cstheme="minorBidi"/>
+                <w:b/>
+                <w:bCs/>
+                <w:sz w:val="22"/>
+                <w:szCs w:val="22"/>
+              </w:rPr>
+            </w:pPr>
+            <w:r>
+              <w:rPr>
+                <w:rFonts w:ascii="MS Gothic" w:hAnsi="MS Gothic" w:eastAsia="MS Gothic" w:cstheme="minorBidi"/>
                 <w:b/>
                 <w:bCs/>
                 <w:sz w:val="22"/>
@@ -3641,7 +3660,7 @@
             <w:pPr>
               <w:jc w:val="center"/>
               <w:rPr>
-                <w:rFonts w:ascii="MS Gothic" w:eastAsia="MS Gothic" w:hAnsi="MS Gothic" w:cstheme="minorBidi"/>
+                <w:rFonts w:ascii="MS Gothic" w:hAnsi="MS Gothic" w:eastAsia="MS Gothic" w:cstheme="minorBidi"/>
                 <w:b/>
                 <w:bCs/>
                 <w:sz w:val="22"/>
@@ -3669,7 +3688,7 @@
             </w:pPr>
             <w:r>
               <w:rPr>
-                <w:rFonts w:ascii="Arial" w:eastAsia="Arial" w:hAnsi="Arial" w:cs="Arial"/>
+                <w:rFonts w:ascii="Arial" w:hAnsi="Arial" w:eastAsia="Arial" w:cs="Arial"/>
                 <w:b/>
                 <w:bCs/>
                 <w:color w:val="000000" w:themeColor="text1"/>
@@ -3819,16 +3838,16 @@
             <w:pPr>
               <w:jc w:val="center"/>
               <w:rPr>
-                <w:rFonts w:ascii="MS Gothic" w:eastAsia="MS Gothic" w:hAnsi="MS Gothic" w:cstheme="minorBidi"/>
-                <w:b/>
-                <w:bCs/>
-                <w:sz w:val="22"/>
-                <w:szCs w:val="22"/>
-              </w:rPr>
-            </w:pPr>
-            <w:r>
-              <w:rPr>
-                <w:rFonts w:ascii="MS Gothic" w:eastAsia="MS Gothic" w:hAnsi="MS Gothic" w:cstheme="minorBidi"/>
+                <w:rFonts w:ascii="MS Gothic" w:hAnsi="MS Gothic" w:eastAsia="MS Gothic" w:cstheme="minorBidi"/>
+                <w:b/>
+                <w:bCs/>
+                <w:sz w:val="22"/>
+                <w:szCs w:val="22"/>
+              </w:rPr>
+            </w:pPr>
+            <w:r>
+              <w:rPr>
+                <w:rFonts w:ascii="MS Gothic" w:hAnsi="MS Gothic" w:eastAsia="MS Gothic" w:cstheme="minorBidi"/>
                 <w:b/>
                 <w:bCs/>
                 <w:sz w:val="22"/>
@@ -3841,7 +3860,7 @@
             <w:pPr>
               <w:jc w:val="center"/>
               <w:rPr>
-                <w:rFonts w:ascii="MS Gothic" w:eastAsia="MS Gothic" w:hAnsi="MS Gothic" w:cstheme="minorBidi"/>
+                <w:rFonts w:ascii="MS Gothic" w:hAnsi="MS Gothic" w:eastAsia="MS Gothic" w:cstheme="minorBidi"/>
                 <w:b/>
                 <w:bCs/>
                 <w:sz w:val="22"/>
@@ -3984,16 +4003,16 @@
             <w:pPr>
               <w:jc w:val="center"/>
               <w:rPr>
-                <w:rFonts w:ascii="MS Gothic" w:eastAsia="MS Gothic" w:hAnsi="MS Gothic" w:cstheme="minorBidi"/>
-                <w:b/>
-                <w:bCs/>
-                <w:sz w:val="22"/>
-                <w:szCs w:val="22"/>
-              </w:rPr>
-            </w:pPr>
-            <w:r>
-              <w:rPr>
-                <w:rFonts w:ascii="MS Gothic" w:eastAsia="MS Gothic" w:hAnsi="MS Gothic" w:cstheme="minorBidi"/>
+                <w:rFonts w:ascii="MS Gothic" w:hAnsi="MS Gothic" w:eastAsia="MS Gothic" w:cstheme="minorBidi"/>
+                <w:b/>
+                <w:bCs/>
+                <w:sz w:val="22"/>
+                <w:szCs w:val="22"/>
+              </w:rPr>
+            </w:pPr>
+            <w:r>
+              <w:rPr>
+                <w:rFonts w:ascii="MS Gothic" w:hAnsi="MS Gothic" w:eastAsia="MS Gothic" w:cstheme="minorBidi"/>
                 <w:b/>
                 <w:bCs/>
                 <w:sz w:val="22"/>
@@ -4006,7 +4025,7 @@
             <w:pPr>
               <w:jc w:val="center"/>
               <w:rPr>
-                <w:rFonts w:ascii="MS Gothic" w:eastAsia="MS Gothic" w:hAnsi="MS Gothic" w:cstheme="minorBidi"/>
+                <w:rFonts w:ascii="MS Gothic" w:hAnsi="MS Gothic" w:eastAsia="MS Gothic" w:cstheme="minorBidi"/>
                 <w:b/>
                 <w:bCs/>
                 <w:sz w:val="22"/>
@@ -4132,16 +4151,16 @@
             <w:pPr>
               <w:jc w:val="center"/>
               <w:rPr>
-                <w:rFonts w:ascii="MS Gothic" w:eastAsia="MS Gothic" w:hAnsi="MS Gothic" w:cstheme="minorBidi"/>
-                <w:b/>
-                <w:bCs/>
-                <w:sz w:val="22"/>
-                <w:szCs w:val="22"/>
-              </w:rPr>
-            </w:pPr>
-            <w:r>
-              <w:rPr>
-                <w:rFonts w:ascii="MS Gothic" w:eastAsia="MS Gothic" w:hAnsi="MS Gothic" w:cstheme="minorBidi"/>
+                <w:rFonts w:ascii="MS Gothic" w:hAnsi="MS Gothic" w:eastAsia="MS Gothic" w:cstheme="minorBidi"/>
+                <w:b/>
+                <w:bCs/>
+                <w:sz w:val="22"/>
+                <w:szCs w:val="22"/>
+              </w:rPr>
+            </w:pPr>
+            <w:r>
+              <w:rPr>
+                <w:rFonts w:ascii="MS Gothic" w:hAnsi="MS Gothic" w:eastAsia="MS Gothic" w:cstheme="minorBidi"/>
                 <w:b/>
                 <w:bCs/>
                 <w:sz w:val="22"/>
@@ -4154,7 +4173,7 @@
             <w:pPr>
               <w:jc w:val="center"/>
               <w:rPr>
-                <w:rFonts w:ascii="MS Gothic" w:eastAsia="MS Gothic" w:hAnsi="MS Gothic" w:cstheme="minorBidi"/>
+                <w:rFonts w:ascii="MS Gothic" w:hAnsi="MS Gothic" w:eastAsia="MS Gothic" w:cstheme="minorBidi"/>
                 <w:b/>
                 <w:bCs/>
                 <w:sz w:val="22"/>
@@ -4240,16 +4259,16 @@
             <w:pPr>
               <w:jc w:val="center"/>
               <w:rPr>
-                <w:rFonts w:ascii="MS Gothic" w:eastAsia="MS Gothic" w:hAnsi="MS Gothic" w:cstheme="minorBidi"/>
-                <w:b/>
-                <w:bCs/>
-                <w:sz w:val="22"/>
-                <w:szCs w:val="22"/>
-              </w:rPr>
-            </w:pPr>
-            <w:r>
-              <w:rPr>
-                <w:rFonts w:ascii="MS Gothic" w:eastAsia="MS Gothic" w:hAnsi="MS Gothic" w:cstheme="minorBidi"/>
+                <w:rFonts w:ascii="MS Gothic" w:hAnsi="MS Gothic" w:eastAsia="MS Gothic" w:cstheme="minorBidi"/>
+                <w:b/>
+                <w:bCs/>
+                <w:sz w:val="22"/>
+                <w:szCs w:val="22"/>
+              </w:rPr>
+            </w:pPr>
+            <w:r>
+              <w:rPr>
+                <w:rFonts w:ascii="MS Gothic" w:hAnsi="MS Gothic" w:eastAsia="MS Gothic" w:cstheme="minorBidi"/>
                 <w:b/>
                 <w:bCs/>
                 <w:sz w:val="22"/>
@@ -4262,7 +4281,7 @@
             <w:pPr>
               <w:jc w:val="center"/>
               <w:rPr>
-                <w:rFonts w:ascii="MS Gothic" w:eastAsia="MS Gothic" w:hAnsi="MS Gothic" w:cstheme="minorBidi"/>
+                <w:rFonts w:ascii="MS Gothic" w:hAnsi="MS Gothic" w:eastAsia="MS Gothic" w:cstheme="minorBidi"/>
                 <w:b/>
                 <w:bCs/>
                 <w:sz w:val="22"/>
@@ -4409,16 +4428,16 @@
             <w:pPr>
               <w:jc w:val="center"/>
               <w:rPr>
-                <w:rFonts w:ascii="MS Gothic" w:eastAsia="MS Gothic" w:hAnsi="MS Gothic" w:cstheme="minorBidi"/>
-                <w:b/>
-                <w:bCs/>
-                <w:sz w:val="22"/>
-                <w:szCs w:val="22"/>
-              </w:rPr>
-            </w:pPr>
-            <w:r>
-              <w:rPr>
-                <w:rFonts w:ascii="MS Gothic" w:eastAsia="MS Gothic" w:hAnsi="MS Gothic" w:cstheme="minorBidi"/>
+                <w:rFonts w:ascii="MS Gothic" w:hAnsi="MS Gothic" w:eastAsia="MS Gothic" w:cstheme="minorBidi"/>
+                <w:b/>
+                <w:bCs/>
+                <w:sz w:val="22"/>
+                <w:szCs w:val="22"/>
+              </w:rPr>
+            </w:pPr>
+            <w:r>
+              <w:rPr>
+                <w:rFonts w:ascii="MS Gothic" w:hAnsi="MS Gothic" w:eastAsia="MS Gothic" w:cstheme="minorBidi"/>
                 <w:b/>
                 <w:bCs/>
                 <w:sz w:val="22"/>
@@ -4431,7 +4450,7 @@
             <w:pPr>
               <w:jc w:val="center"/>
               <w:rPr>
-                <w:rFonts w:ascii="MS Gothic" w:eastAsia="MS Gothic" w:hAnsi="MS Gothic" w:cstheme="minorBidi"/>
+                <w:rFonts w:ascii="MS Gothic" w:hAnsi="MS Gothic" w:eastAsia="MS Gothic" w:cstheme="minorBidi"/>
                 <w:b/>
                 <w:bCs/>
                 <w:sz w:val="22"/>
@@ -4459,7 +4478,7 @@
             </w:pPr>
             <w:r>
               <w:rPr>
-                <w:rFonts w:ascii="Arial" w:eastAsia="Arial" w:hAnsi="Arial" w:cs="Arial"/>
+                <w:rFonts w:ascii="Arial" w:hAnsi="Arial" w:eastAsia="Arial" w:cs="Arial"/>
                 <w:b/>
                 <w:bCs/>
                 <w:sz w:val="20"/>
@@ -4669,16 +4688,16 @@
             <w:pPr>
               <w:jc w:val="center"/>
               <w:rPr>
-                <w:rFonts w:ascii="MS Gothic" w:eastAsia="MS Gothic" w:hAnsi="MS Gothic" w:cstheme="minorBidi"/>
-                <w:b/>
-                <w:bCs/>
-                <w:sz w:val="22"/>
-                <w:szCs w:val="22"/>
-              </w:rPr>
-            </w:pPr>
-            <w:r>
-              <w:rPr>
-                <w:rFonts w:ascii="MS Gothic" w:eastAsia="MS Gothic" w:hAnsi="MS Gothic" w:cstheme="minorBidi"/>
+                <w:rFonts w:ascii="MS Gothic" w:hAnsi="MS Gothic" w:eastAsia="MS Gothic" w:cstheme="minorBidi"/>
+                <w:b/>
+                <w:bCs/>
+                <w:sz w:val="22"/>
+                <w:szCs w:val="22"/>
+              </w:rPr>
+            </w:pPr>
+            <w:r>
+              <w:rPr>
+                <w:rFonts w:ascii="MS Gothic" w:hAnsi="MS Gothic" w:eastAsia="MS Gothic" w:cstheme="minorBidi"/>
                 <w:b/>
                 <w:bCs/>
                 <w:sz w:val="22"/>
@@ -4688,7 +4707,7 @@
             </w:r>
             <w:r>
               <w:rPr>
-                <w:rFonts w:ascii="MS Gothic" w:eastAsia="MS Gothic" w:hAnsi="MS Gothic" w:cstheme="minorBidi"/>
+                <w:rFonts w:ascii="MS Gothic" w:hAnsi="MS Gothic" w:eastAsia="MS Gothic" w:cstheme="minorBidi"/>
                 <w:b/>
                 <w:bCs/>
                 <w:sz w:val="22"/>
@@ -4811,7 +4830,7 @@
             </w:pPr>
             <w:r>
               <w:rPr>
-                <w:rFonts w:ascii="MS Gothic" w:eastAsia="MS Gothic" w:hAnsi="MS Gothic" w:cstheme="minorBidi"/>
+                <w:rFonts w:ascii="MS Gothic" w:hAnsi="MS Gothic" w:eastAsia="MS Gothic" w:cstheme="minorBidi"/>
                 <w:b/>
                 <w:bCs/>
                 <w:sz w:val="22"/>
@@ -4929,7 +4948,7 @@
             </w:pPr>
             <w:r>
               <w:rPr>
-                <w:rFonts w:ascii="MS Gothic" w:eastAsia="MS Gothic" w:hAnsi="MS Gothic" w:cstheme="minorBidi"/>
+                <w:rFonts w:ascii="MS Gothic" w:hAnsi="MS Gothic" w:eastAsia="MS Gothic" w:cstheme="minorBidi"/>
                 <w:b/>
                 <w:bCs/>
                 <w:sz w:val="22"/>
@@ -5036,7 +5055,7 @@
             </w:pPr>
             <w:r>
               <w:rPr>
-                <w:rFonts w:ascii="MS Gothic" w:eastAsia="MS Gothic" w:hAnsi="MS Gothic" w:cstheme="minorBidi"/>
+                <w:rFonts w:ascii="MS Gothic" w:hAnsi="MS Gothic" w:eastAsia="MS Gothic" w:cstheme="minorBidi"/>
                 <w:b/>
                 <w:bCs/>
                 <w:sz w:val="22"/>
@@ -5061,7 +5080,7 @@
     <w:p/>
     <w:p/>
     <w:sectPr>
-      <w:pgSz w:w="11906" w:h="16838"/>
+      <w:pgSz w:w="11906" w:h="16838" w:orient="portrait"/>
       <w:pgMar w:top="1440" w:right="1440" w:bottom="1440" w:left="1440" w:header="708" w:footer="708" w:gutter="0"/>
       <w:cols w:space="708"/>
       <w:docGrid w:linePitch="360"/>
@@ -5183,7 +5202,7 @@
         <w:ind w:left="1440" w:hanging="360"/>
       </w:pPr>
       <w:rPr>
-        <w:rFonts w:ascii="Courier New" w:hAnsi="Courier New" w:cs="Courier New" w:hint="default"/>
+        <w:rFonts w:hint="default" w:ascii="Courier New" w:hAnsi="Courier New" w:cs="Courier New"/>
       </w:rPr>
     </w:lvl>
     <w:lvl w:ilvl="2" w:tplc="0809001B" w:tentative="1">
@@ -5436,7 +5455,7 @@
         <w:ind w:left="360" w:hanging="360"/>
       </w:pPr>
       <w:rPr>
-        <w:rFonts w:ascii="Symbol" w:hAnsi="Symbol" w:hint="default"/>
+        <w:rFonts w:hint="default" w:ascii="Symbol" w:hAnsi="Symbol"/>
       </w:rPr>
     </w:lvl>
     <w:lvl w:ilvl="1" w:tplc="27925ED2">
@@ -5448,7 +5467,7 @@
         <w:ind w:left="1080" w:hanging="360"/>
       </w:pPr>
       <w:rPr>
-        <w:rFonts w:ascii="Courier New" w:hAnsi="Courier New" w:hint="default"/>
+        <w:rFonts w:hint="default" w:ascii="Courier New" w:hAnsi="Courier New"/>
       </w:rPr>
     </w:lvl>
     <w:lvl w:ilvl="2" w:tplc="1B085FE4">
@@ -5460,7 +5479,7 @@
         <w:ind w:left="1800" w:hanging="360"/>
       </w:pPr>
       <w:rPr>
-        <w:rFonts w:ascii="Wingdings" w:hAnsi="Wingdings" w:hint="default"/>
+        <w:rFonts w:hint="default" w:ascii="Wingdings" w:hAnsi="Wingdings"/>
       </w:rPr>
     </w:lvl>
     <w:lvl w:ilvl="3" w:tplc="31DE96A6">
@@ -5472,7 +5491,7 @@
         <w:ind w:left="2520" w:hanging="360"/>
       </w:pPr>
       <w:rPr>
-        <w:rFonts w:ascii="Symbol" w:hAnsi="Symbol" w:hint="default"/>
+        <w:rFonts w:hint="default" w:ascii="Symbol" w:hAnsi="Symbol"/>
       </w:rPr>
     </w:lvl>
     <w:lvl w:ilvl="4" w:tplc="D270BD10">
@@ -5484,7 +5503,7 @@
         <w:ind w:left="3240" w:hanging="360"/>
       </w:pPr>
       <w:rPr>
-        <w:rFonts w:ascii="Courier New" w:hAnsi="Courier New" w:hint="default"/>
+        <w:rFonts w:hint="default" w:ascii="Courier New" w:hAnsi="Courier New"/>
       </w:rPr>
     </w:lvl>
     <w:lvl w:ilvl="5" w:tplc="85B03702">
@@ -5496,7 +5515,7 @@
         <w:ind w:left="3960" w:hanging="360"/>
       </w:pPr>
       <w:rPr>
-        <w:rFonts w:ascii="Wingdings" w:hAnsi="Wingdings" w:hint="default"/>
+        <w:rFonts w:hint="default" w:ascii="Wingdings" w:hAnsi="Wingdings"/>
       </w:rPr>
     </w:lvl>
     <w:lvl w:ilvl="6" w:tplc="AAD651BE">
@@ -5508,7 +5527,7 @@
         <w:ind w:left="4680" w:hanging="360"/>
       </w:pPr>
       <w:rPr>
-        <w:rFonts w:ascii="Symbol" w:hAnsi="Symbol" w:hint="default"/>
+        <w:rFonts w:hint="default" w:ascii="Symbol" w:hAnsi="Symbol"/>
       </w:rPr>
     </w:lvl>
     <w:lvl w:ilvl="7" w:tplc="7ECE48E0">
@@ -5520,7 +5539,7 @@
         <w:ind w:left="5400" w:hanging="360"/>
       </w:pPr>
       <w:rPr>
-        <w:rFonts w:ascii="Courier New" w:hAnsi="Courier New" w:hint="default"/>
+        <w:rFonts w:hint="default" w:ascii="Courier New" w:hAnsi="Courier New"/>
       </w:rPr>
     </w:lvl>
     <w:lvl w:ilvl="8" w:tplc="1CF6667A">
@@ -5532,7 +5551,7 @@
         <w:ind w:left="6120" w:hanging="360"/>
       </w:pPr>
       <w:rPr>
-        <w:rFonts w:ascii="Wingdings" w:hAnsi="Wingdings" w:hint="default"/>
+        <w:rFonts w:hint="default" w:ascii="Wingdings" w:hAnsi="Wingdings"/>
       </w:rPr>
     </w:lvl>
   </w:abstractNum>
@@ -5817,7 +5836,7 @@
         <w:ind w:left="720" w:hanging="360"/>
       </w:pPr>
       <w:rPr>
-        <w:rFonts w:ascii="Wingdings" w:hAnsi="Wingdings" w:hint="default"/>
+        <w:rFonts w:hint="default" w:ascii="Wingdings" w:hAnsi="Wingdings"/>
       </w:rPr>
     </w:lvl>
     <w:lvl w:ilvl="1" w:tplc="08090003">
@@ -5829,7 +5848,7 @@
         <w:ind w:left="1440" w:hanging="360"/>
       </w:pPr>
       <w:rPr>
-        <w:rFonts w:ascii="Courier New" w:hAnsi="Courier New" w:cs="Courier New" w:hint="default"/>
+        <w:rFonts w:hint="default" w:ascii="Courier New" w:hAnsi="Courier New" w:cs="Courier New"/>
       </w:rPr>
     </w:lvl>
     <w:lvl w:ilvl="2" w:tplc="08090005" w:tentative="1">
@@ -5841,7 +5860,7 @@
         <w:ind w:left="2160" w:hanging="360"/>
       </w:pPr>
       <w:rPr>
-        <w:rFonts w:ascii="Wingdings" w:hAnsi="Wingdings" w:hint="default"/>
+        <w:rFonts w:hint="default" w:ascii="Wingdings" w:hAnsi="Wingdings"/>
       </w:rPr>
     </w:lvl>
     <w:lvl w:ilvl="3" w:tplc="08090001" w:tentative="1">
@@ -5853,7 +5872,7 @@
         <w:ind w:left="2880" w:hanging="360"/>
       </w:pPr>
       <w:rPr>
-        <w:rFonts w:ascii="Symbol" w:hAnsi="Symbol" w:hint="default"/>
+        <w:rFonts w:hint="default" w:ascii="Symbol" w:hAnsi="Symbol"/>
       </w:rPr>
     </w:lvl>
     <w:lvl w:ilvl="4" w:tplc="08090003" w:tentative="1">
@@ -5865,7 +5884,7 @@
         <w:ind w:left="3600" w:hanging="360"/>
       </w:pPr>
       <w:rPr>
-        <w:rFonts w:ascii="Courier New" w:hAnsi="Courier New" w:cs="Courier New" w:hint="default"/>
+        <w:rFonts w:hint="default" w:ascii="Courier New" w:hAnsi="Courier New" w:cs="Courier New"/>
       </w:rPr>
     </w:lvl>
     <w:lvl w:ilvl="5" w:tplc="08090005" w:tentative="1">
@@ -5877,7 +5896,7 @@
         <w:ind w:left="4320" w:hanging="360"/>
       </w:pPr>
       <w:rPr>
-        <w:rFonts w:ascii="Wingdings" w:hAnsi="Wingdings" w:hint="default"/>
+        <w:rFonts w:hint="default" w:ascii="Wingdings" w:hAnsi="Wingdings"/>
       </w:rPr>
     </w:lvl>
     <w:lvl w:ilvl="6" w:tplc="08090001" w:tentative="1">
@@ -5889,7 +5908,7 @@
         <w:ind w:left="5040" w:hanging="360"/>
       </w:pPr>
       <w:rPr>
-        <w:rFonts w:ascii="Symbol" w:hAnsi="Symbol" w:hint="default"/>
+        <w:rFonts w:hint="default" w:ascii="Symbol" w:hAnsi="Symbol"/>
       </w:rPr>
     </w:lvl>
     <w:lvl w:ilvl="7" w:tplc="08090003" w:tentative="1">
@@ -5901,7 +5920,7 @@
         <w:ind w:left="5760" w:hanging="360"/>
       </w:pPr>
       <w:rPr>
-        <w:rFonts w:ascii="Courier New" w:hAnsi="Courier New" w:cs="Courier New" w:hint="default"/>
+        <w:rFonts w:hint="default" w:ascii="Courier New" w:hAnsi="Courier New" w:cs="Courier New"/>
       </w:rPr>
     </w:lvl>
     <w:lvl w:ilvl="8" w:tplc="08090005" w:tentative="1">
@@ -5913,7 +5932,7 @@
         <w:ind w:left="6480" w:hanging="360"/>
       </w:pPr>
       <w:rPr>
-        <w:rFonts w:ascii="Wingdings" w:hAnsi="Wingdings" w:hint="default"/>
+        <w:rFonts w:hint="default" w:ascii="Wingdings" w:hAnsi="Wingdings"/>
       </w:rPr>
     </w:lvl>
   </w:abstractNum>
@@ -6016,7 +6035,7 @@
         <w:ind w:left="1080" w:hanging="360"/>
       </w:pPr>
       <w:rPr>
-        <w:rFonts w:ascii="Wingdings" w:hAnsi="Wingdings" w:hint="default"/>
+        <w:rFonts w:hint="default" w:ascii="Wingdings" w:hAnsi="Wingdings"/>
       </w:rPr>
     </w:lvl>
     <w:lvl w:ilvl="1" w:tplc="F4CE4178">
@@ -6028,7 +6047,7 @@
         <w:ind w:left="1800" w:hanging="360"/>
       </w:pPr>
       <w:rPr>
-        <w:rFonts w:ascii="Courier New" w:hAnsi="Courier New" w:hint="default"/>
+        <w:rFonts w:hint="default" w:ascii="Courier New" w:hAnsi="Courier New"/>
       </w:rPr>
     </w:lvl>
     <w:lvl w:ilvl="2" w:tplc="0FA23F30">
@@ -6040,7 +6059,7 @@
         <w:ind w:left="2520" w:hanging="360"/>
       </w:pPr>
       <w:rPr>
-        <w:rFonts w:ascii="Wingdings" w:hAnsi="Wingdings" w:hint="default"/>
+        <w:rFonts w:hint="default" w:ascii="Wingdings" w:hAnsi="Wingdings"/>
       </w:rPr>
     </w:lvl>
     <w:lvl w:ilvl="3" w:tplc="8C4E1F90">
@@ -6052,7 +6071,7 @@
         <w:ind w:left="3240" w:hanging="360"/>
       </w:pPr>
       <w:rPr>
-        <w:rFonts w:ascii="Symbol" w:hAnsi="Symbol" w:hint="default"/>
+        <w:rFonts w:hint="default" w:ascii="Symbol" w:hAnsi="Symbol"/>
       </w:rPr>
     </w:lvl>
     <w:lvl w:ilvl="4" w:tplc="2772C626">
@@ -6064,7 +6083,7 @@
         <w:ind w:left="3960" w:hanging="360"/>
       </w:pPr>
       <w:rPr>
-        <w:rFonts w:ascii="Courier New" w:hAnsi="Courier New" w:hint="default"/>
+        <w:rFonts w:hint="default" w:ascii="Courier New" w:hAnsi="Courier New"/>
       </w:rPr>
     </w:lvl>
     <w:lvl w:ilvl="5" w:tplc="13AAD290">
@@ -6076,7 +6095,7 @@
         <w:ind w:left="4680" w:hanging="360"/>
       </w:pPr>
       <w:rPr>
-        <w:rFonts w:ascii="Wingdings" w:hAnsi="Wingdings" w:hint="default"/>
+        <w:rFonts w:hint="default" w:ascii="Wingdings" w:hAnsi="Wingdings"/>
       </w:rPr>
     </w:lvl>
     <w:lvl w:ilvl="6" w:tplc="632E6AC8">
@@ -6088,7 +6107,7 @@
         <w:ind w:left="5400" w:hanging="360"/>
       </w:pPr>
       <w:rPr>
-        <w:rFonts w:ascii="Symbol" w:hAnsi="Symbol" w:hint="default"/>
+        <w:rFonts w:hint="default" w:ascii="Symbol" w:hAnsi="Symbol"/>
       </w:rPr>
     </w:lvl>
     <w:lvl w:ilvl="7" w:tplc="E0D4A980">
@@ -6100,7 +6119,7 @@
         <w:ind w:left="6120" w:hanging="360"/>
       </w:pPr>
       <w:rPr>
-        <w:rFonts w:ascii="Courier New" w:hAnsi="Courier New" w:hint="default"/>
+        <w:rFonts w:hint="default" w:ascii="Courier New" w:hAnsi="Courier New"/>
       </w:rPr>
     </w:lvl>
     <w:lvl w:ilvl="8" w:tplc="1A2EC76E">
@@ -6112,7 +6131,7 @@
         <w:ind w:left="6840" w:hanging="360"/>
       </w:pPr>
       <w:rPr>
-        <w:rFonts w:ascii="Wingdings" w:hAnsi="Wingdings" w:hint="default"/>
+        <w:rFonts w:hint="default" w:ascii="Wingdings" w:hAnsi="Wingdings"/>
       </w:rPr>
     </w:lvl>
   </w:abstractNum>
@@ -6129,7 +6148,7 @@
         <w:ind w:left="720" w:hanging="360"/>
       </w:pPr>
       <w:rPr>
-        <w:rFonts w:ascii="Wingdings" w:hAnsi="Wingdings" w:hint="default"/>
+        <w:rFonts w:hint="default" w:ascii="Wingdings" w:hAnsi="Wingdings"/>
       </w:rPr>
     </w:lvl>
     <w:lvl w:ilvl="1" w:tplc="08090003">
@@ -6141,7 +6160,7 @@
         <w:ind w:left="1440" w:hanging="360"/>
       </w:pPr>
       <w:rPr>
-        <w:rFonts w:ascii="Courier New" w:hAnsi="Courier New" w:cs="Courier New" w:hint="default"/>
+        <w:rFonts w:hint="default" w:ascii="Courier New" w:hAnsi="Courier New" w:cs="Courier New"/>
       </w:rPr>
     </w:lvl>
     <w:lvl w:ilvl="2" w:tplc="08090005" w:tentative="1">
@@ -6153,7 +6172,7 @@
         <w:ind w:left="2160" w:hanging="360"/>
       </w:pPr>
       <w:rPr>
-        <w:rFonts w:ascii="Wingdings" w:hAnsi="Wingdings" w:hint="default"/>
+        <w:rFonts w:hint="default" w:ascii="Wingdings" w:hAnsi="Wingdings"/>
       </w:rPr>
     </w:lvl>
     <w:lvl w:ilvl="3" w:tplc="08090001" w:tentative="1">
@@ -6165,7 +6184,7 @@
         <w:ind w:left="2880" w:hanging="360"/>
       </w:pPr>
       <w:rPr>
-        <w:rFonts w:ascii="Symbol" w:hAnsi="Symbol" w:hint="default"/>
+        <w:rFonts w:hint="default" w:ascii="Symbol" w:hAnsi="Symbol"/>
       </w:rPr>
     </w:lvl>
     <w:lvl w:ilvl="4" w:tplc="08090003" w:tentative="1">
@@ -6177,7 +6196,7 @@
         <w:ind w:left="3600" w:hanging="360"/>
       </w:pPr>
       <w:rPr>
-        <w:rFonts w:ascii="Courier New" w:hAnsi="Courier New" w:cs="Courier New" w:hint="default"/>
+        <w:rFonts w:hint="default" w:ascii="Courier New" w:hAnsi="Courier New" w:cs="Courier New"/>
       </w:rPr>
     </w:lvl>
     <w:lvl w:ilvl="5" w:tplc="08090005" w:tentative="1">
@@ -6189,7 +6208,7 @@
         <w:ind w:left="4320" w:hanging="360"/>
       </w:pPr>
       <w:rPr>
-        <w:rFonts w:ascii="Wingdings" w:hAnsi="Wingdings" w:hint="default"/>
+        <w:rFonts w:hint="default" w:ascii="Wingdings" w:hAnsi="Wingdings"/>
       </w:rPr>
     </w:lvl>
     <w:lvl w:ilvl="6" w:tplc="08090001" w:tentative="1">
@@ -6201,7 +6220,7 @@
         <w:ind w:left="5040" w:hanging="360"/>
       </w:pPr>
       <w:rPr>
-        <w:rFonts w:ascii="Symbol" w:hAnsi="Symbol" w:hint="default"/>
+        <w:rFonts w:hint="default" w:ascii="Symbol" w:hAnsi="Symbol"/>
       </w:rPr>
     </w:lvl>
     <w:lvl w:ilvl="7" w:tplc="08090003" w:tentative="1">
@@ -6213,7 +6232,7 @@
         <w:ind w:left="5760" w:hanging="360"/>
       </w:pPr>
       <w:rPr>
-        <w:rFonts w:ascii="Courier New" w:hAnsi="Courier New" w:cs="Courier New" w:hint="default"/>
+        <w:rFonts w:hint="default" w:ascii="Courier New" w:hAnsi="Courier New" w:cs="Courier New"/>
       </w:rPr>
     </w:lvl>
     <w:lvl w:ilvl="8" w:tplc="08090005" w:tentative="1">
@@ -6225,7 +6244,7 @@
         <w:ind w:left="6480" w:hanging="360"/>
       </w:pPr>
       <w:rPr>
-        <w:rFonts w:ascii="Wingdings" w:hAnsi="Wingdings" w:hint="default"/>
+        <w:rFonts w:hint="default" w:ascii="Wingdings" w:hAnsi="Wingdings"/>
       </w:rPr>
     </w:lvl>
   </w:abstractNum>
@@ -6242,7 +6261,7 @@
         <w:ind w:left="720" w:hanging="360"/>
       </w:pPr>
       <w:rPr>
-        <w:rFonts w:ascii="Symbol" w:hAnsi="Symbol" w:hint="default"/>
+        <w:rFonts w:hint="default" w:ascii="Symbol" w:hAnsi="Symbol"/>
       </w:rPr>
     </w:lvl>
     <w:lvl w:ilvl="1" w:tplc="08090003">
@@ -6254,7 +6273,7 @@
         <w:ind w:left="1440" w:hanging="360"/>
       </w:pPr>
       <w:rPr>
-        <w:rFonts w:ascii="Courier New" w:hAnsi="Courier New" w:cs="Courier New" w:hint="default"/>
+        <w:rFonts w:hint="default" w:ascii="Courier New" w:hAnsi="Courier New" w:cs="Courier New"/>
       </w:rPr>
     </w:lvl>
     <w:lvl w:ilvl="2" w:tplc="08090005">
@@ -6266,7 +6285,7 @@
         <w:ind w:left="2160" w:hanging="360"/>
       </w:pPr>
       <w:rPr>
-        <w:rFonts w:ascii="Wingdings" w:hAnsi="Wingdings" w:hint="default"/>
+        <w:rFonts w:hint="default" w:ascii="Wingdings" w:hAnsi="Wingdings"/>
       </w:rPr>
     </w:lvl>
     <w:lvl w:ilvl="3" w:tplc="08090001">
@@ -6278,7 +6297,7 @@
         <w:ind w:left="2880" w:hanging="360"/>
       </w:pPr>
       <w:rPr>
-        <w:rFonts w:ascii="Symbol" w:hAnsi="Symbol" w:hint="default"/>
+        <w:rFonts w:hint="default" w:ascii="Symbol" w:hAnsi="Symbol"/>
       </w:rPr>
     </w:lvl>
     <w:lvl w:ilvl="4" w:tplc="08090003">
@@ -6290,7 +6309,7 @@
         <w:ind w:left="3600" w:hanging="360"/>
       </w:pPr>
       <w:rPr>
-        <w:rFonts w:ascii="Courier New" w:hAnsi="Courier New" w:cs="Courier New" w:hint="default"/>
+        <w:rFonts w:hint="default" w:ascii="Courier New" w:hAnsi="Courier New" w:cs="Courier New"/>
       </w:rPr>
     </w:lvl>
     <w:lvl w:ilvl="5" w:tplc="08090005">
@@ -6302,7 +6321,7 @@
         <w:ind w:left="4320" w:hanging="360"/>
       </w:pPr>
       <w:rPr>
-        <w:rFonts w:ascii="Wingdings" w:hAnsi="Wingdings" w:hint="default"/>
+        <w:rFonts w:hint="default" w:ascii="Wingdings" w:hAnsi="Wingdings"/>
       </w:rPr>
     </w:lvl>
     <w:lvl w:ilvl="6" w:tplc="08090001">
@@ -6314,7 +6333,7 @@
         <w:ind w:left="5040" w:hanging="360"/>
       </w:pPr>
       <w:rPr>
-        <w:rFonts w:ascii="Symbol" w:hAnsi="Symbol" w:hint="default"/>
+        <w:rFonts w:hint="default" w:ascii="Symbol" w:hAnsi="Symbol"/>
       </w:rPr>
     </w:lvl>
     <w:lvl w:ilvl="7" w:tplc="08090003">
@@ -6326,7 +6345,7 @@
         <w:ind w:left="5760" w:hanging="360"/>
       </w:pPr>
       <w:rPr>
-        <w:rFonts w:ascii="Courier New" w:hAnsi="Courier New" w:cs="Courier New" w:hint="default"/>
+        <w:rFonts w:hint="default" w:ascii="Courier New" w:hAnsi="Courier New" w:cs="Courier New"/>
       </w:rPr>
     </w:lvl>
     <w:lvl w:ilvl="8" w:tplc="08090005">
@@ -6338,7 +6357,7 @@
         <w:ind w:left="6480" w:hanging="360"/>
       </w:pPr>
       <w:rPr>
-        <w:rFonts w:ascii="Wingdings" w:hAnsi="Wingdings" w:hint="default"/>
+        <w:rFonts w:hint="default" w:ascii="Wingdings" w:hAnsi="Wingdings"/>
       </w:rPr>
     </w:lvl>
   </w:abstractNum>
@@ -6355,7 +6374,7 @@
         <w:ind w:left="720" w:hanging="360"/>
       </w:pPr>
       <w:rPr>
-        <w:rFonts w:ascii="Wingdings" w:hAnsi="Wingdings" w:hint="default"/>
+        <w:rFonts w:hint="default" w:ascii="Wingdings" w:hAnsi="Wingdings"/>
       </w:rPr>
     </w:lvl>
     <w:lvl w:ilvl="1" w:tplc="08090003">
@@ -6367,7 +6386,7 @@
         <w:ind w:left="1440" w:hanging="360"/>
       </w:pPr>
       <w:rPr>
-        <w:rFonts w:ascii="Courier New" w:hAnsi="Courier New" w:cs="Courier New" w:hint="default"/>
+        <w:rFonts w:hint="default" w:ascii="Courier New" w:hAnsi="Courier New" w:cs="Courier New"/>
       </w:rPr>
     </w:lvl>
     <w:lvl w:ilvl="2" w:tplc="08090005" w:tentative="1">
@@ -6379,7 +6398,7 @@
         <w:ind w:left="2160" w:hanging="360"/>
       </w:pPr>
       <w:rPr>
-        <w:rFonts w:ascii="Wingdings" w:hAnsi="Wingdings" w:hint="default"/>
+        <w:rFonts w:hint="default" w:ascii="Wingdings" w:hAnsi="Wingdings"/>
       </w:rPr>
     </w:lvl>
     <w:lvl w:ilvl="3" w:tplc="08090001" w:tentative="1">
@@ -6391,7 +6410,7 @@
         <w:ind w:left="2880" w:hanging="360"/>
       </w:pPr>
       <w:rPr>
-        <w:rFonts w:ascii="Symbol" w:hAnsi="Symbol" w:hint="default"/>
+        <w:rFonts w:hint="default" w:ascii="Symbol" w:hAnsi="Symbol"/>
       </w:rPr>
     </w:lvl>
     <w:lvl w:ilvl="4" w:tplc="08090003" w:tentative="1">
@@ -6403,7 +6422,7 @@
         <w:ind w:left="3600" w:hanging="360"/>
       </w:pPr>
       <w:rPr>
-        <w:rFonts w:ascii="Courier New" w:hAnsi="Courier New" w:cs="Courier New" w:hint="default"/>
+        <w:rFonts w:hint="default" w:ascii="Courier New" w:hAnsi="Courier New" w:cs="Courier New"/>
       </w:rPr>
     </w:lvl>
     <w:lvl w:ilvl="5" w:tplc="08090005" w:tentative="1">
@@ -6415,7 +6434,7 @@
         <w:ind w:left="4320" w:hanging="360"/>
       </w:pPr>
       <w:rPr>
-        <w:rFonts w:ascii="Wingdings" w:hAnsi="Wingdings" w:hint="default"/>
+        <w:rFonts w:hint="default" w:ascii="Wingdings" w:hAnsi="Wingdings"/>
       </w:rPr>
     </w:lvl>
     <w:lvl w:ilvl="6" w:tplc="08090001" w:tentative="1">
@@ -6427,7 +6446,7 @@
         <w:ind w:left="5040" w:hanging="360"/>
       </w:pPr>
       <w:rPr>
-        <w:rFonts w:ascii="Symbol" w:hAnsi="Symbol" w:hint="default"/>
+        <w:rFonts w:hint="default" w:ascii="Symbol" w:hAnsi="Symbol"/>
       </w:rPr>
     </w:lvl>
     <w:lvl w:ilvl="7" w:tplc="08090003" w:tentative="1">
@@ -6439,7 +6458,7 @@
         <w:ind w:left="5760" w:hanging="360"/>
       </w:pPr>
       <w:rPr>
-        <w:rFonts w:ascii="Courier New" w:hAnsi="Courier New" w:cs="Courier New" w:hint="default"/>
+        <w:rFonts w:hint="default" w:ascii="Courier New" w:hAnsi="Courier New" w:cs="Courier New"/>
       </w:rPr>
     </w:lvl>
     <w:lvl w:ilvl="8" w:tplc="08090005" w:tentative="1">
@@ -6451,7 +6470,7 @@
         <w:ind w:left="6480" w:hanging="360"/>
       </w:pPr>
       <w:rPr>
-        <w:rFonts w:ascii="Wingdings" w:hAnsi="Wingdings" w:hint="default"/>
+        <w:rFonts w:hint="default" w:ascii="Wingdings" w:hAnsi="Wingdings"/>
       </w:rPr>
     </w:lvl>
   </w:abstractNum>
@@ -6480,7 +6499,7 @@
         <w:ind w:left="1440" w:hanging="360"/>
       </w:pPr>
       <w:rPr>
-        <w:rFonts w:ascii="Courier New" w:hAnsi="Courier New" w:cs="Courier New" w:hint="default"/>
+        <w:rFonts w:hint="default" w:ascii="Courier New" w:hAnsi="Courier New" w:cs="Courier New"/>
       </w:rPr>
     </w:lvl>
     <w:lvl w:ilvl="2" w:tplc="0809001B" w:tentative="1">
@@ -6733,7 +6752,7 @@
         <w:ind w:left="360" w:hanging="360"/>
       </w:pPr>
       <w:rPr>
-        <w:rFonts w:ascii="Wingdings" w:hAnsi="Wingdings" w:hint="default"/>
+        <w:rFonts w:hint="default" w:ascii="Wingdings" w:hAnsi="Wingdings"/>
       </w:rPr>
     </w:lvl>
     <w:lvl w:ilvl="1" w:tplc="94F2A078">
@@ -6745,7 +6764,7 @@
         <w:ind w:left="1080" w:hanging="360"/>
       </w:pPr>
       <w:rPr>
-        <w:rFonts w:ascii="Courier New" w:hAnsi="Courier New" w:hint="default"/>
+        <w:rFonts w:hint="default" w:ascii="Courier New" w:hAnsi="Courier New"/>
       </w:rPr>
     </w:lvl>
     <w:lvl w:ilvl="2" w:tplc="9DCC16DC">
@@ -6757,7 +6776,7 @@
         <w:ind w:left="1800" w:hanging="360"/>
       </w:pPr>
       <w:rPr>
-        <w:rFonts w:ascii="Wingdings" w:hAnsi="Wingdings" w:hint="default"/>
+        <w:rFonts w:hint="default" w:ascii="Wingdings" w:hAnsi="Wingdings"/>
       </w:rPr>
     </w:lvl>
     <w:lvl w:ilvl="3" w:tplc="659C869C">
@@ -6769,7 +6788,7 @@
         <w:ind w:left="2520" w:hanging="360"/>
       </w:pPr>
       <w:rPr>
-        <w:rFonts w:ascii="Symbol" w:hAnsi="Symbol" w:hint="default"/>
+        <w:rFonts w:hint="default" w:ascii="Symbol" w:hAnsi="Symbol"/>
       </w:rPr>
     </w:lvl>
     <w:lvl w:ilvl="4" w:tplc="A5A64130">
@@ -6781,7 +6800,7 @@
         <w:ind w:left="3240" w:hanging="360"/>
       </w:pPr>
       <w:rPr>
-        <w:rFonts w:ascii="Courier New" w:hAnsi="Courier New" w:hint="default"/>
+        <w:rFonts w:hint="default" w:ascii="Courier New" w:hAnsi="Courier New"/>
       </w:rPr>
     </w:lvl>
     <w:lvl w:ilvl="5" w:tplc="58A04F58">
@@ -6793,7 +6812,7 @@
         <w:ind w:left="3960" w:hanging="360"/>
       </w:pPr>
       <w:rPr>
-        <w:rFonts w:ascii="Wingdings" w:hAnsi="Wingdings" w:hint="default"/>
+        <w:rFonts w:hint="default" w:ascii="Wingdings" w:hAnsi="Wingdings"/>
       </w:rPr>
     </w:lvl>
     <w:lvl w:ilvl="6" w:tplc="5052F47C">
@@ -6805,7 +6824,7 @@
         <w:ind w:left="4680" w:hanging="360"/>
       </w:pPr>
       <w:rPr>
-        <w:rFonts w:ascii="Symbol" w:hAnsi="Symbol" w:hint="default"/>
+        <w:rFonts w:hint="default" w:ascii="Symbol" w:hAnsi="Symbol"/>
       </w:rPr>
     </w:lvl>
     <w:lvl w:ilvl="7" w:tplc="F452933A">
@@ -6817,7 +6836,7 @@
         <w:ind w:left="5400" w:hanging="360"/>
       </w:pPr>
       <w:rPr>
-        <w:rFonts w:ascii="Courier New" w:hAnsi="Courier New" w:hint="default"/>
+        <w:rFonts w:hint="default" w:ascii="Courier New" w:hAnsi="Courier New"/>
       </w:rPr>
     </w:lvl>
     <w:lvl w:ilvl="8" w:tplc="A7B42296">
@@ -6829,7 +6848,7 @@
         <w:ind w:left="6120" w:hanging="360"/>
       </w:pPr>
       <w:rPr>
-        <w:rFonts w:ascii="Wingdings" w:hAnsi="Wingdings" w:hint="default"/>
+        <w:rFonts w:hint="default" w:ascii="Wingdings" w:hAnsi="Wingdings"/>
       </w:rPr>
     </w:lvl>
   </w:abstractNum>
@@ -6846,7 +6865,7 @@
         <w:ind w:left="1080" w:hanging="360"/>
       </w:pPr>
       <w:rPr>
-        <w:rFonts w:ascii="Wingdings" w:hAnsi="Wingdings" w:hint="default"/>
+        <w:rFonts w:hint="default" w:ascii="Wingdings" w:hAnsi="Wingdings"/>
       </w:rPr>
     </w:lvl>
     <w:lvl w:ilvl="1" w:tplc="6B8EBB0C">
@@ -6858,7 +6877,7 @@
         <w:ind w:left="1800" w:hanging="360"/>
       </w:pPr>
       <w:rPr>
-        <w:rFonts w:ascii="Courier New" w:hAnsi="Courier New" w:hint="default"/>
+        <w:rFonts w:hint="default" w:ascii="Courier New" w:hAnsi="Courier New"/>
       </w:rPr>
     </w:lvl>
     <w:lvl w:ilvl="2" w:tplc="39EA4BA0">
@@ -6870,7 +6889,7 @@
         <w:ind w:left="2520" w:hanging="360"/>
       </w:pPr>
       <w:rPr>
-        <w:rFonts w:ascii="Wingdings" w:hAnsi="Wingdings" w:hint="default"/>
+        <w:rFonts w:hint="default" w:ascii="Wingdings" w:hAnsi="Wingdings"/>
       </w:rPr>
     </w:lvl>
     <w:lvl w:ilvl="3" w:tplc="A46C74E8">
@@ -6882,7 +6901,7 @@
         <w:ind w:left="3240" w:hanging="360"/>
       </w:pPr>
       <w:rPr>
-        <w:rFonts w:ascii="Symbol" w:hAnsi="Symbol" w:hint="default"/>
+        <w:rFonts w:hint="default" w:ascii="Symbol" w:hAnsi="Symbol"/>
       </w:rPr>
     </w:lvl>
     <w:lvl w:ilvl="4" w:tplc="6D780F0A">
@@ -6894,7 +6913,7 @@
         <w:ind w:left="3960" w:hanging="360"/>
       </w:pPr>
       <w:rPr>
-        <w:rFonts w:ascii="Courier New" w:hAnsi="Courier New" w:hint="default"/>
+        <w:rFonts w:hint="default" w:ascii="Courier New" w:hAnsi="Courier New"/>
       </w:rPr>
     </w:lvl>
     <w:lvl w:ilvl="5" w:tplc="2E7A4F66">
@@ -6906,7 +6925,7 @@
         <w:ind w:left="4680" w:hanging="360"/>
       </w:pPr>
       <w:rPr>
-        <w:rFonts w:ascii="Wingdings" w:hAnsi="Wingdings" w:hint="default"/>
+        <w:rFonts w:hint="default" w:ascii="Wingdings" w:hAnsi="Wingdings"/>
       </w:rPr>
     </w:lvl>
     <w:lvl w:ilvl="6" w:tplc="50CC0CE4">
@@ -6918,7 +6937,7 @@
         <w:ind w:left="5400" w:hanging="360"/>
       </w:pPr>
       <w:rPr>
-        <w:rFonts w:ascii="Symbol" w:hAnsi="Symbol" w:hint="default"/>
+        <w:rFonts w:hint="default" w:ascii="Symbol" w:hAnsi="Symbol"/>
       </w:rPr>
     </w:lvl>
     <w:lvl w:ilvl="7" w:tplc="FC26CE5E">
@@ -6930,7 +6949,7 @@
         <w:ind w:left="6120" w:hanging="360"/>
       </w:pPr>
       <w:rPr>
-        <w:rFonts w:ascii="Courier New" w:hAnsi="Courier New" w:hint="default"/>
+        <w:rFonts w:hint="default" w:ascii="Courier New" w:hAnsi="Courier New"/>
       </w:rPr>
     </w:lvl>
     <w:lvl w:ilvl="8" w:tplc="87CC2BC2">
@@ -6942,7 +6961,7 @@
         <w:ind w:left="6840" w:hanging="360"/>
       </w:pPr>
       <w:rPr>
-        <w:rFonts w:ascii="Wingdings" w:hAnsi="Wingdings" w:hint="default"/>
+        <w:rFonts w:hint="default" w:ascii="Wingdings" w:hAnsi="Wingdings"/>
       </w:rPr>
     </w:lvl>
   </w:abstractNum>
@@ -7048,7 +7067,7 @@
         <w:ind w:left="720" w:hanging="360"/>
       </w:pPr>
       <w:rPr>
-        <w:rFonts w:ascii="Symbol" w:hAnsi="Symbol" w:hint="default"/>
+        <w:rFonts w:hint="default" w:ascii="Symbol" w:hAnsi="Symbol"/>
       </w:rPr>
     </w:lvl>
     <w:lvl w:ilvl="1" w:tplc="08090003" w:tentative="1">
@@ -7060,7 +7079,7 @@
         <w:ind w:left="1440" w:hanging="360"/>
       </w:pPr>
       <w:rPr>
-        <w:rFonts w:ascii="Courier New" w:hAnsi="Courier New" w:cs="Courier New" w:hint="default"/>
+        <w:rFonts w:hint="default" w:ascii="Courier New" w:hAnsi="Courier New" w:cs="Courier New"/>
       </w:rPr>
     </w:lvl>
     <w:lvl w:ilvl="2" w:tplc="08090005" w:tentative="1">
@@ -7072,7 +7091,7 @@
         <w:ind w:left="2160" w:hanging="360"/>
       </w:pPr>
       <w:rPr>
-        <w:rFonts w:ascii="Wingdings" w:hAnsi="Wingdings" w:hint="default"/>
+        <w:rFonts w:hint="default" w:ascii="Wingdings" w:hAnsi="Wingdings"/>
       </w:rPr>
     </w:lvl>
     <w:lvl w:ilvl="3" w:tplc="08090001" w:tentative="1">
@@ -7084,7 +7103,7 @@
         <w:ind w:left="2880" w:hanging="360"/>
       </w:pPr>
       <w:rPr>
-        <w:rFonts w:ascii="Symbol" w:hAnsi="Symbol" w:hint="default"/>
+        <w:rFonts w:hint="default" w:ascii="Symbol" w:hAnsi="Symbol"/>
       </w:rPr>
     </w:lvl>
     <w:lvl w:ilvl="4" w:tplc="08090003" w:tentative="1">
@@ -7096,7 +7115,7 @@
         <w:ind w:left="3600" w:hanging="360"/>
       </w:pPr>
       <w:rPr>
-        <w:rFonts w:ascii="Courier New" w:hAnsi="Courier New" w:cs="Courier New" w:hint="default"/>
+        <w:rFonts w:hint="default" w:ascii="Courier New" w:hAnsi="Courier New" w:cs="Courier New"/>
       </w:rPr>
     </w:lvl>
     <w:lvl w:ilvl="5" w:tplc="08090005" w:tentative="1">
@@ -7108,7 +7127,7 @@
         <w:ind w:left="4320" w:hanging="360"/>
       </w:pPr>
       <w:rPr>
-        <w:rFonts w:ascii="Wingdings" w:hAnsi="Wingdings" w:hint="default"/>
+        <w:rFonts w:hint="default" w:ascii="Wingdings" w:hAnsi="Wingdings"/>
       </w:rPr>
     </w:lvl>
     <w:lvl w:ilvl="6" w:tplc="08090001" w:tentative="1">
@@ -7120,7 +7139,7 @@
         <w:ind w:left="5040" w:hanging="360"/>
       </w:pPr>
       <w:rPr>
-        <w:rFonts w:ascii="Symbol" w:hAnsi="Symbol" w:hint="default"/>
+        <w:rFonts w:hint="default" w:ascii="Symbol" w:hAnsi="Symbol"/>
       </w:rPr>
     </w:lvl>
     <w:lvl w:ilvl="7" w:tplc="08090003" w:tentative="1">
@@ -7132,7 +7151,7 @@
         <w:ind w:left="5760" w:hanging="360"/>
       </w:pPr>
       <w:rPr>
-        <w:rFonts w:ascii="Courier New" w:hAnsi="Courier New" w:cs="Courier New" w:hint="default"/>
+        <w:rFonts w:hint="default" w:ascii="Courier New" w:hAnsi="Courier New" w:cs="Courier New"/>
       </w:rPr>
     </w:lvl>
     <w:lvl w:ilvl="8" w:tplc="08090005" w:tentative="1">
@@ -7144,7 +7163,7 @@
         <w:ind w:left="6480" w:hanging="360"/>
       </w:pPr>
       <w:rPr>
-        <w:rFonts w:ascii="Wingdings" w:hAnsi="Wingdings" w:hint="default"/>
+        <w:rFonts w:hint="default" w:ascii="Wingdings" w:hAnsi="Wingdings"/>
       </w:rPr>
     </w:lvl>
   </w:abstractNum>
@@ -7305,11 +7324,11 @@
 </file>
 
 <file path=word/styles.xml><?xml version="1.0" encoding="utf-8"?>
-<w:styles xmlns:mc="http://schemas.openxmlformats.org/markup-compatibility/2006" xmlns:r="http://schemas.openxmlformats.org/officeDocument/2006/relationships" xmlns:w="http://schemas.openxmlformats.org/wordprocessingml/2006/main" xmlns:w14="http://schemas.microsoft.com/office/word/2010/wordml" xmlns:w15="http://schemas.microsoft.com/office/word/2012/wordml" xmlns:w16cex="http://schemas.microsoft.com/office/word/2018/wordml/cex" xmlns:w16cid="http://schemas.microsoft.com/office/word/2016/wordml/cid" xmlns:w16="http://schemas.microsoft.com/office/word/2018/wordml" xmlns:w16du="http://schemas.microsoft.com/office/word/2023/wordml/word16du" xmlns:w16sdtdh="http://schemas.microsoft.com/office/word/2020/wordml/sdtdatahash" xmlns:w16sdtfl="http://schemas.microsoft.com/office/word/2024/wordml/sdtformatlock" xmlns:w16se="http://schemas.microsoft.com/office/word/2015/wordml/symex" mc:Ignorable="w14 w15 w16se w16cid w16 w16cex w16sdtdh w16sdtfl w16du">
+<w:styles xmlns:wp14="http://schemas.microsoft.com/office/word/2010/wordprocessingDrawing" xmlns:mc="http://schemas.openxmlformats.org/markup-compatibility/2006" xmlns:r="http://schemas.openxmlformats.org/officeDocument/2006/relationships" xmlns:w="http://schemas.openxmlformats.org/wordprocessingml/2006/main" xmlns:w14="http://schemas.microsoft.com/office/word/2010/wordml" xmlns:w15="http://schemas.microsoft.com/office/word/2012/wordml" xmlns:w16cex="http://schemas.microsoft.com/office/word/2018/wordml/cex" xmlns:w16cid="http://schemas.microsoft.com/office/word/2016/wordml/cid" xmlns:w16="http://schemas.microsoft.com/office/word/2018/wordml" xmlns:w16du="http://schemas.microsoft.com/office/word/2023/wordml/word16du" xmlns:w16sdtdh="http://schemas.microsoft.com/office/word/2020/wordml/sdtdatahash" xmlns:w16sdtfl="http://schemas.microsoft.com/office/word/2024/wordml/sdtformatlock" xmlns:w16se="http://schemas.microsoft.com/office/word/2015/wordml/symex" mc:Ignorable="w14 w15 w16se w16cid w16 w16cex w16sdtdh w16sdtfl w16du wp14">
   <w:docDefaults>
     <w:rPrDefault>
       <w:rPr>
-        <w:rFonts w:asciiTheme="minorHAnsi" w:eastAsiaTheme="minorHAnsi" w:hAnsiTheme="minorHAnsi" w:cstheme="minorBidi"/>
+        <w:rFonts w:asciiTheme="minorHAnsi" w:hAnsiTheme="minorHAnsi" w:eastAsiaTheme="minorHAnsi" w:cstheme="minorBidi"/>
         <w:sz w:val="22"/>
         <w:szCs w:val="22"/>
         <w:lang w:val="en-GB" w:eastAsia="en-US" w:bidi="ar-SA"/>
@@ -7324,14 +7343,14 @@
   <w:latentStyles w:defLockedState="0" w:defUIPriority="99" w:defSemiHidden="0" w:defUnhideWhenUsed="0" w:defQFormat="0" w:count="376">
     <w:lsdException w:name="Normal" w:uiPriority="0" w:qFormat="1"/>
     <w:lsdException w:name="heading 1" w:uiPriority="9" w:qFormat="1"/>
-    <w:lsdException w:name="heading 2" w:semiHidden="1" w:uiPriority="9" w:unhideWhenUsed="1" w:qFormat="1"/>
-    <w:lsdException w:name="heading 3" w:semiHidden="1" w:uiPriority="9" w:unhideWhenUsed="1" w:qFormat="1"/>
-    <w:lsdException w:name="heading 4" w:semiHidden="1" w:uiPriority="9" w:unhideWhenUsed="1" w:qFormat="1"/>
-    <w:lsdException w:name="heading 5" w:semiHidden="1" w:uiPriority="9" w:unhideWhenUsed="1" w:qFormat="1"/>
-    <w:lsdException w:name="heading 6" w:semiHidden="1" w:uiPriority="9" w:unhideWhenUsed="1" w:qFormat="1"/>
-    <w:lsdException w:name="heading 7" w:semiHidden="1" w:uiPriority="9" w:unhideWhenUsed="1" w:qFormat="1"/>
-    <w:lsdException w:name="heading 8" w:semiHidden="1" w:uiPriority="9" w:unhideWhenUsed="1" w:qFormat="1"/>
-    <w:lsdException w:name="heading 9" w:semiHidden="1" w:uiPriority="9" w:unhideWhenUsed="1" w:qFormat="1"/>
+    <w:lsdException w:name="heading 2" w:uiPriority="9" w:semiHidden="1" w:unhideWhenUsed="1" w:qFormat="1"/>
+    <w:lsdException w:name="heading 3" w:uiPriority="9" w:semiHidden="1" w:unhideWhenUsed="1" w:qFormat="1"/>
+    <w:lsdException w:name="heading 4" w:uiPriority="9" w:semiHidden="1" w:unhideWhenUsed="1" w:qFormat="1"/>
+    <w:lsdException w:name="heading 5" w:uiPriority="9" w:semiHidden="1" w:unhideWhenUsed="1" w:qFormat="1"/>
+    <w:lsdException w:name="heading 6" w:uiPriority="9" w:semiHidden="1" w:unhideWhenUsed="1" w:qFormat="1"/>
+    <w:lsdException w:name="heading 7" w:uiPriority="9" w:semiHidden="1" w:unhideWhenUsed="1" w:qFormat="1"/>
+    <w:lsdException w:name="heading 8" w:uiPriority="9" w:semiHidden="1" w:unhideWhenUsed="1" w:qFormat="1"/>
+    <w:lsdException w:name="heading 9" w:uiPriority="9" w:semiHidden="1" w:unhideWhenUsed="1" w:qFormat="1"/>
     <w:lsdException w:name="index 1" w:semiHidden="1" w:unhideWhenUsed="1"/>
     <w:lsdException w:name="index 2" w:semiHidden="1" w:unhideWhenUsed="1"/>
     <w:lsdException w:name="index 3" w:semiHidden="1" w:unhideWhenUsed="1"/>
@@ -7341,22 +7360,22 @@
     <w:lsdException w:name="index 7" w:semiHidden="1" w:unhideWhenUsed="1"/>
     <w:lsdException w:name="index 8" w:semiHidden="1" w:unhideWhenUsed="1"/>
     <w:lsdException w:name="index 9" w:semiHidden="1" w:unhideWhenUsed="1"/>
-    <w:lsdException w:name="toc 1" w:semiHidden="1" w:uiPriority="39" w:unhideWhenUsed="1"/>
-    <w:lsdException w:name="toc 2" w:semiHidden="1" w:uiPriority="39" w:unhideWhenUsed="1"/>
-    <w:lsdException w:name="toc 3" w:semiHidden="1" w:uiPriority="39" w:unhideWhenUsed="1"/>
-    <w:lsdException w:name="toc 4" w:semiHidden="1" w:uiPriority="39" w:unhideWhenUsed="1"/>
-    <w:lsdException w:name="toc 5" w:semiHidden="1" w:uiPriority="39" w:unhideWhenUsed="1"/>
-    <w:lsdException w:name="toc 6" w:semiHidden="1" w:uiPriority="39" w:unhideWhenUsed="1"/>
-    <w:lsdException w:name="toc 7" w:semiHidden="1" w:uiPriority="39" w:unhideWhenUsed="1"/>
-    <w:lsdException w:name="toc 8" w:semiHidden="1" w:uiPriority="39" w:unhideWhenUsed="1"/>
-    <w:lsdException w:name="toc 9" w:semiHidden="1" w:uiPriority="39" w:unhideWhenUsed="1"/>
+    <w:lsdException w:name="toc 1" w:uiPriority="39" w:semiHidden="1" w:unhideWhenUsed="1"/>
+    <w:lsdException w:name="toc 2" w:uiPriority="39" w:semiHidden="1" w:unhideWhenUsed="1"/>
+    <w:lsdException w:name="toc 3" w:uiPriority="39" w:semiHidden="1" w:unhideWhenUsed="1"/>
+    <w:lsdException w:name="toc 4" w:uiPriority="39" w:semiHidden="1" w:unhideWhenUsed="1"/>
+    <w:lsdException w:name="toc 5" w:uiPriority="39" w:semiHidden="1" w:unhideWhenUsed="1"/>
+    <w:lsdException w:name="toc 6" w:uiPriority="39" w:semiHidden="1" w:unhideWhenUsed="1"/>
+    <w:lsdException w:name="toc 7" w:uiPriority="39" w:semiHidden="1" w:unhideWhenUsed="1"/>
+    <w:lsdException w:name="toc 8" w:uiPriority="39" w:semiHidden="1" w:unhideWhenUsed="1"/>
+    <w:lsdException w:name="toc 9" w:uiPriority="39" w:semiHidden="1" w:unhideWhenUsed="1"/>
     <w:lsdException w:name="Normal Indent" w:semiHidden="1" w:unhideWhenUsed="1"/>
     <w:lsdException w:name="footnote text" w:semiHidden="1" w:unhideWhenUsed="1"/>
     <w:lsdException w:name="annotation text" w:semiHidden="1" w:unhideWhenUsed="1"/>
-    <w:lsdException w:name="header" w:semiHidden="1" w:uiPriority="0" w:unhideWhenUsed="1"/>
+    <w:lsdException w:name="header" w:uiPriority="0" w:semiHidden="1" w:unhideWhenUsed="1"/>
     <w:lsdException w:name="footer" w:semiHidden="1" w:unhideWhenUsed="1"/>
     <w:lsdException w:name="index heading" w:semiHidden="1" w:unhideWhenUsed="1"/>
-    <w:lsdException w:name="caption" w:semiHidden="1" w:uiPriority="35" w:unhideWhenUsed="1" w:qFormat="1"/>
+    <w:lsdException w:name="caption" w:uiPriority="35" w:semiHidden="1" w:unhideWhenUsed="1" w:qFormat="1"/>
     <w:lsdException w:name="table of figures" w:semiHidden="1" w:unhideWhenUsed="1"/>
     <w:lsdException w:name="envelope address" w:semiHidden="1" w:unhideWhenUsed="1"/>
     <w:lsdException w:name="envelope return" w:semiHidden="1" w:unhideWhenUsed="1"/>
@@ -7387,7 +7406,7 @@
     <w:lsdException w:name="Title" w:uiPriority="10" w:qFormat="1"/>
     <w:lsdException w:name="Closing" w:semiHidden="1" w:unhideWhenUsed="1"/>
     <w:lsdException w:name="Signature" w:semiHidden="1" w:unhideWhenUsed="1"/>
-    <w:lsdException w:name="Default Paragraph Font" w:semiHidden="1" w:uiPriority="1" w:unhideWhenUsed="1"/>
+    <w:lsdException w:name="Default Paragraph Font" w:uiPriority="1" w:semiHidden="1" w:unhideWhenUsed="1"/>
     <w:lsdException w:name="Body Text" w:semiHidden="1" w:unhideWhenUsed="1"/>
     <w:lsdException w:name="Body Text Indent" w:semiHidden="1" w:unhideWhenUsed="1"/>
     <w:lsdException w:name="List Continue" w:semiHidden="1" w:unhideWhenUsed="1"/>
@@ -7587,8 +7606,8 @@
     <w:lsdException w:name="Subtle Reference" w:uiPriority="31" w:qFormat="1"/>
     <w:lsdException w:name="Intense Reference" w:uiPriority="32" w:qFormat="1"/>
     <w:lsdException w:name="Book Title" w:uiPriority="33" w:qFormat="1"/>
-    <w:lsdException w:name="Bibliography" w:semiHidden="1" w:uiPriority="37" w:unhideWhenUsed="1"/>
-    <w:lsdException w:name="TOC Heading" w:semiHidden="1" w:uiPriority="39" w:unhideWhenUsed="1" w:qFormat="1"/>
+    <w:lsdException w:name="Bibliography" w:uiPriority="37" w:semiHidden="1" w:unhideWhenUsed="1"/>
+    <w:lsdException w:name="TOC Heading" w:uiPriority="39" w:semiHidden="1" w:unhideWhenUsed="1" w:qFormat="1"/>
     <w:lsdException w:name="Plain Table 1" w:uiPriority="41"/>
     <w:lsdException w:name="Plain Table 2" w:uiPriority="42"/>
     <w:lsdException w:name="Plain Table 3" w:uiPriority="43"/>
@@ -7699,7 +7718,7 @@
     <w:lsdException w:name="Unresolved Mention" w:semiHidden="1" w:unhideWhenUsed="1"/>
     <w:lsdException w:name="Smart Link" w:semiHidden="1" w:unhideWhenUsed="1"/>
   </w:latentStyles>
-  <w:style w:type="paragraph" w:default="1" w:styleId="Normal">
+  <w:style w:type="paragraph" w:styleId="Normal" w:default="1">
     <w:name w:val="Normal"/>
     <w:qFormat/>
     <w:rsid w:val="00E32C0A"/>
@@ -7707,17 +7726,17 @@
       <w:spacing w:after="0" w:line="240" w:lineRule="auto"/>
     </w:pPr>
     <w:rPr>
-      <w:rFonts w:ascii="Times New Roman" w:eastAsia="Times New Roman" w:hAnsi="Times New Roman" w:cs="Times New Roman"/>
+      <w:rFonts w:ascii="Times New Roman" w:hAnsi="Times New Roman" w:eastAsia="Times New Roman" w:cs="Times New Roman"/>
       <w:sz w:val="24"/>
       <w:szCs w:val="20"/>
     </w:rPr>
   </w:style>
-  <w:style w:type="character" w:default="1" w:styleId="DefaultParagraphFont">
+  <w:style w:type="character" w:styleId="DefaultParagraphFont" w:default="1">
     <w:name w:val="Default Paragraph Font"/>
     <w:uiPriority w:val="1"/>
     <w:unhideWhenUsed/>
   </w:style>
-  <w:style w:type="table" w:default="1" w:styleId="TableNormal">
+  <w:style w:type="table" w:styleId="TableNormal" w:default="1">
     <w:name w:val="Normal Table"/>
     <w:uiPriority w:val="99"/>
     <w:semiHidden/>
@@ -7732,7 +7751,7 @@
       </w:tblCellMar>
     </w:tblPr>
   </w:style>
-  <w:style w:type="numbering" w:default="1" w:styleId="NoList">
+  <w:style w:type="numbering" w:styleId="NoList" w:default="1">
     <w:name w:val="No List"/>
     <w:uiPriority w:val="99"/>
     <w:semiHidden/>
@@ -7759,12 +7778,12 @@
     </w:pPr>
     <w:tblPr>
       <w:tblBorders>
-        <w:top w:val="single" w:sz="4" w:space="0" w:color="auto"/>
-        <w:left w:val="single" w:sz="4" w:space="0" w:color="auto"/>
-        <w:bottom w:val="single" w:sz="4" w:space="0" w:color="auto"/>
-        <w:right w:val="single" w:sz="4" w:space="0" w:color="auto"/>
-        <w:insideH w:val="single" w:sz="4" w:space="0" w:color="auto"/>
-        <w:insideV w:val="single" w:sz="4" w:space="0" w:color="auto"/>
+        <w:top w:val="single" w:color="auto" w:sz="4" w:space="0"/>
+        <w:left w:val="single" w:color="auto" w:sz="4" w:space="0"/>
+        <w:bottom w:val="single" w:color="auto" w:sz="4" w:space="0"/>
+        <w:right w:val="single" w:color="auto" w:sz="4" w:space="0"/>
+        <w:insideH w:val="single" w:color="auto" w:sz="4" w:space="0"/>
+        <w:insideV w:val="single" w:color="auto" w:sz="4" w:space="0"/>
       </w:tblBorders>
     </w:tblPr>
   </w:style>
@@ -7783,13 +7802,13 @@
       <w:sz w:val="16"/>
     </w:rPr>
   </w:style>
-  <w:style w:type="character" w:customStyle="1" w:styleId="HeaderChar">
+  <w:style w:type="character" w:styleId="HeaderChar" w:customStyle="1">
     <w:name w:val="Header Char"/>
     <w:basedOn w:val="DefaultParagraphFont"/>
     <w:link w:val="Header"/>
     <w:rsid w:val="00E32C0A"/>
     <w:rPr>
-      <w:rFonts w:ascii="Times New Roman" w:eastAsia="Times New Roman" w:hAnsi="Times New Roman" w:cs="Times New Roman"/>
+      <w:rFonts w:ascii="Times New Roman" w:hAnsi="Times New Roman" w:eastAsia="Times New Roman" w:cs="Times New Roman"/>
       <w:sz w:val="16"/>
       <w:szCs w:val="20"/>
     </w:rPr>
@@ -7810,14 +7829,14 @@
       <w:sz w:val="16"/>
     </w:rPr>
   </w:style>
-  <w:style w:type="character" w:customStyle="1" w:styleId="FooterChar">
+  <w:style w:type="character" w:styleId="FooterChar" w:customStyle="1">
     <w:name w:val="Footer Char"/>
     <w:basedOn w:val="DefaultParagraphFont"/>
     <w:link w:val="Footer"/>
     <w:uiPriority w:val="99"/>
     <w:rsid w:val="00E32C0A"/>
     <w:rPr>
-      <w:rFonts w:ascii="Times New Roman" w:eastAsia="Times New Roman" w:hAnsi="Times New Roman" w:cs="Times New Roman"/>
+      <w:rFonts w:ascii="Times New Roman" w:hAnsi="Times New Roman" w:eastAsia="Times New Roman" w:cs="Times New Roman"/>
       <w:sz w:val="16"/>
       <w:szCs w:val="20"/>
     </w:rPr>
@@ -7832,7 +7851,7 @@
       <w:color w:val="808080"/>
     </w:rPr>
   </w:style>
-  <w:style w:type="paragraph" w:customStyle="1" w:styleId="Standard">
+  <w:style w:type="paragraph" w:styleId="Standard" w:customStyle="1">
     <w:name w:val="Standard"/>
     <w:rsid w:val="00EF7597"/>
     <w:pPr>
@@ -7842,7 +7861,7 @@
       <w:textAlignment w:val="baseline"/>
     </w:pPr>
     <w:rPr>
-      <w:rFonts w:ascii="Times New Roman" w:eastAsia="Times New Roman" w:hAnsi="Times New Roman" w:cs="Times New Roman"/>
+      <w:rFonts w:ascii="Times New Roman" w:hAnsi="Times New Roman" w:eastAsia="Times New Roman" w:cs="Times New Roman"/>
       <w:kern w:val="3"/>
       <w:sz w:val="24"/>
       <w:szCs w:val="24"/>
@@ -7853,7 +7872,7 @@
 </file>
 
 <file path=word/theme/theme1.xml><?xml version="1.0" encoding="utf-8"?>
-<a:theme xmlns:a="http://schemas.openxmlformats.org/drawingml/2006/main" name="Office Theme">
+<a:theme xmlns:a="http://schemas.openxmlformats.org/drawingml/2006/main" xmlns:thm15="http://schemas.microsoft.com/office/thememl/2012/main" name="Office Theme">
   <a:themeElements>
     <a:clrScheme name="Office">
       <a:dk1>

</xml_diff>